<commit_message>
change logik for create order
</commit_message>
<xml_diff>
--- a/src/services/documents/order/templates/14_100_top18.docx
+++ b/src/services/documents/order/templates/14_100_top18.docx
@@ -23,12 +23,12 @@
           <w:lang w:eastAsia="ru-RU"/>
         </w:rPr>
         <w:drawing>
-          <wp:inline distT="0" distB="0" distL="0" distR="0" wp14:anchorId="21D84257" wp14:editId="0075CB77">
-            <wp:extent cx="419100" cy="609600"/>
-            <wp:effectExtent l="0" t="0" r="0" b="0"/>
+          <wp:inline distT="0" distB="0" distL="0" distR="0" wp14:anchorId="6112687A" wp14:editId="1A3EF10E">
+            <wp:extent cx="432000" cy="612000"/>
+            <wp:effectExtent l="0" t="0" r="6350" b="0"/>
             <wp:docPr id="3" name="Рисунок 3"/>
             <wp:cNvGraphicFramePr>
-              <a:graphicFrameLocks xmlns:a="http://schemas.openxmlformats.org/drawingml/2006/main" noChangeAspect="1"/>
+              <a:graphicFrameLocks xmlns:a="http://schemas.openxmlformats.org/drawingml/2006/main"/>
             </wp:cNvGraphicFramePr>
             <a:graphic xmlns:a="http://schemas.openxmlformats.org/drawingml/2006/main">
               <a:graphicData uri="http://schemas.openxmlformats.org/drawingml/2006/picture">
@@ -56,7 +56,7 @@
                   <pic:spPr bwMode="auto">
                     <a:xfrm>
                       <a:off x="0" y="0"/>
-                      <a:ext cx="419100" cy="609600"/>
+                      <a:ext cx="432000" cy="612000"/>
                     </a:xfrm>
                     <a:prstGeom prst="rect">
                       <a:avLst/>
@@ -75,18 +75,13 @@
     </w:p>
     <w:p>
       <w:pPr>
-        <w:tabs>
-          <w:tab w:val="left" w:pos="0"/>
-        </w:tabs>
-        <w:spacing w:after="0" w:line="240" w:lineRule="auto"/>
+        <w:spacing w:before="420" w:after="420" w:line="240" w:lineRule="auto"/>
         <w:jc w:val="center"/>
         <w:rPr>
-          <w:rFonts w:ascii="Times New Roman" w:eastAsia="Times New Roman" w:hAnsi="Times New Roman" w:cs="Times New Roman"/>
-          <w:b/>
-          <w:bCs/>
-          <w:sz w:val="28"/>
-          <w:szCs w:val="28"/>
-          <w:lang w:eastAsia="ru-RU"/>
+          <w:rFonts w:ascii="Times New Roman" w:hAnsi="Times New Roman" w:cs="Times New Roman"/>
+          <w:sz w:val="28"/>
+          <w:szCs w:val="28"/>
+          <w:lang w:val="uk-UA"/>
         </w:rPr>
       </w:pPr>
       <w:r>
@@ -110,69 +105,38 @@
         <w:jc w:val="center"/>
         <w:rPr>
           <w:rFonts w:ascii="Times New Roman" w:eastAsia="Times New Roman" w:hAnsi="Times New Roman" w:cs="Times New Roman"/>
+          <w:b/>
+          <w:bCs/>
           <w:sz w:val="28"/>
           <w:szCs w:val="28"/>
           <w:lang w:eastAsia="ru-RU"/>
         </w:rPr>
       </w:pPr>
+      <w:r>
+        <w:rPr>
+          <w:rFonts w:ascii="Times New Roman" w:eastAsia="Times New Roman" w:hAnsi="Times New Roman" w:cs="Times New Roman"/>
+          <w:b/>
+          <w:bCs/>
+          <w:sz w:val="28"/>
+          <w:szCs w:val="28"/>
+          <w:lang w:eastAsia="ru-RU"/>
+        </w:rPr>
+        <w:t>Н А К А З</w:t>
+      </w:r>
     </w:p>
     <w:p>
       <w:pPr>
-        <w:tabs>
-          <w:tab w:val="left" w:pos="0"/>
-        </w:tabs>
-        <w:spacing w:after="0" w:line="240" w:lineRule="auto"/>
+        <w:spacing w:before="420" w:after="420" w:line="240" w:lineRule="auto"/>
         <w:jc w:val="center"/>
         <w:rPr>
-          <w:rFonts w:ascii="Times New Roman" w:eastAsia="Times New Roman" w:hAnsi="Times New Roman" w:cs="Times New Roman"/>
-          <w:b/>
-          <w:bCs/>
-          <w:sz w:val="28"/>
-          <w:szCs w:val="28"/>
-          <w:lang w:eastAsia="ru-RU"/>
+          <w:rFonts w:ascii="Times New Roman" w:hAnsi="Times New Roman" w:cs="Times New Roman"/>
+          <w:sz w:val="28"/>
+          <w:szCs w:val="28"/>
+          <w:lang w:val="uk-UA"/>
         </w:rPr>
       </w:pPr>
       <w:r>
         <w:rPr>
-          <w:rFonts w:ascii="Times New Roman" w:eastAsia="Times New Roman" w:hAnsi="Times New Roman" w:cs="Times New Roman"/>
-          <w:b/>
-          <w:bCs/>
-          <w:sz w:val="28"/>
-          <w:szCs w:val="28"/>
-          <w:lang w:eastAsia="ru-RU"/>
-        </w:rPr>
-        <w:t>Н А К А З</w:t>
-      </w:r>
-    </w:p>
-    <w:p>
-      <w:pPr>
-        <w:tabs>
-          <w:tab w:val="left" w:pos="0"/>
-        </w:tabs>
-        <w:spacing w:after="0" w:line="240" w:lineRule="auto"/>
-        <w:jc w:val="center"/>
-        <w:rPr>
-          <w:rFonts w:ascii="Times New Roman" w:eastAsia="Times New Roman" w:hAnsi="Times New Roman" w:cs="Times New Roman"/>
-          <w:b/>
-          <w:bCs/>
-          <w:sz w:val="28"/>
-          <w:szCs w:val="28"/>
-          <w:lang w:eastAsia="ru-RU"/>
-        </w:rPr>
-      </w:pPr>
-    </w:p>
-    <w:p>
-      <w:pPr>
-        <w:spacing w:line="240" w:lineRule="auto"/>
-        <w:jc w:val="center"/>
-        <w:rPr>
-          <w:rFonts w:ascii="Times New Roman" w:hAnsi="Times New Roman" w:cs="Times New Roman"/>
-          <w:sz w:val="28"/>
-          <w:szCs w:val="28"/>
-        </w:rPr>
-      </w:pPr>
-      <w:r>
-        <w:rPr>
           <w:rFonts w:ascii="Times New Roman" w:hAnsi="Times New Roman" w:cs="Times New Roman"/>
           <w:sz w:val="28"/>
           <w:szCs w:val="28"/>
@@ -198,28 +162,26 @@
         </w:rPr>
         <w:t>}</w:t>
       </w:r>
-    </w:p>
-    <w:p>
-      <w:pPr>
-        <w:spacing w:line="240" w:lineRule="auto"/>
-        <w:rPr>
-          <w:rFonts w:ascii="Times New Roman" w:hAnsi="Times New Roman" w:cs="Times New Roman"/>
-          <w:sz w:val="28"/>
-          <w:szCs w:val="28"/>
-        </w:rPr>
-      </w:pPr>
     </w:p>
     <w:tbl>
       <w:tblPr>
         <w:tblStyle w:val="ac"/>
         <w:tblW w:w="0" w:type="auto"/>
+        <w:tblBorders>
+          <w:top w:val="none" w:sz="0" w:space="0" w:color="auto"/>
+          <w:left w:val="none" w:sz="0" w:space="0" w:color="auto"/>
+          <w:bottom w:val="none" w:sz="0" w:space="0" w:color="auto"/>
+          <w:right w:val="none" w:sz="0" w:space="0" w:color="auto"/>
+          <w:insideH w:val="none" w:sz="0" w:space="0" w:color="auto"/>
+          <w:insideV w:val="none" w:sz="0" w:space="0" w:color="auto"/>
+        </w:tblBorders>
         <w:tblLook w:val="04A0" w:firstRow="1" w:lastRow="0" w:firstColumn="1" w:lastColumn="0" w:noHBand="0" w:noVBand="1"/>
       </w:tblPr>
       <w:tblGrid>
-        <w:gridCol w:w="3117"/>
-        <w:gridCol w:w="869"/>
-        <w:gridCol w:w="2248"/>
-        <w:gridCol w:w="3110"/>
+        <w:gridCol w:w="3120"/>
+        <w:gridCol w:w="1015"/>
+        <w:gridCol w:w="2106"/>
+        <w:gridCol w:w="3113"/>
       </w:tblGrid>
       <w:tr>
         <w:tc>
@@ -331,7 +293,7 @@
       <w:tr>
         <w:tc>
           <w:tcPr>
-            <w:tcW w:w="4077" w:type="dxa"/>
+            <w:tcW w:w="4219" w:type="dxa"/>
             <w:gridSpan w:val="2"/>
           </w:tcPr>
           <w:p>
@@ -382,22 +344,8 @@
         </w:tc>
         <w:tc>
           <w:tcPr>
-            <w:tcW w:w="2303" w:type="dxa"/>
-          </w:tcPr>
-          <w:p>
-            <w:pPr>
-              <w:jc w:val="center"/>
-              <w:rPr>
-                <w:rFonts w:ascii="Times New Roman" w:hAnsi="Times New Roman" w:cs="Times New Roman"/>
-                <w:sz w:val="28"/>
-                <w:szCs w:val="28"/>
-              </w:rPr>
-            </w:pPr>
-          </w:p>
-        </w:tc>
-        <w:tc>
-          <w:tcPr>
-            <w:tcW w:w="3190" w:type="dxa"/>
+            <w:tcW w:w="5351" w:type="dxa"/>
+            <w:gridSpan w:val="2"/>
           </w:tcPr>
           <w:p>
             <w:pPr>
@@ -758,10 +706,12 @@
     <w:p>
       <w:pPr>
         <w:spacing w:line="240" w:lineRule="auto"/>
-        <w:rPr>
-          <w:rFonts w:ascii="Times New Roman" w:hAnsi="Times New Roman" w:cs="Times New Roman"/>
-          <w:sz w:val="28"/>
-          <w:szCs w:val="28"/>
+        <w:ind w:firstLine="720"/>
+        <w:rPr>
+          <w:rFonts w:ascii="Times New Roman" w:hAnsi="Times New Roman" w:cs="Times New Roman"/>
+          <w:sz w:val="28"/>
+          <w:szCs w:val="28"/>
+          <w:lang w:val="uk-UA"/>
         </w:rPr>
       </w:pPr>
       <w:r>
@@ -795,75 +745,47 @@
     </w:p>
     <w:p>
       <w:pPr>
-        <w:spacing w:line="240" w:lineRule="auto"/>
-        <w:rPr>
-          <w:rFonts w:ascii="Times New Roman" w:hAnsi="Times New Roman" w:cs="Times New Roman"/>
-          <w:sz w:val="28"/>
-          <w:szCs w:val="28"/>
+        <w:spacing w:before="560" w:after="560" w:line="240" w:lineRule="auto"/>
+        <w:rPr>
+          <w:rFonts w:ascii="Times New Roman" w:hAnsi="Times New Roman" w:cs="Times New Roman"/>
+          <w:sz w:val="28"/>
+          <w:szCs w:val="28"/>
+          <w:lang w:val="uk-UA"/>
         </w:rPr>
       </w:pPr>
+      <w:r>
+        <w:rPr>
+          <w:rFonts w:ascii="Times New Roman" w:hAnsi="Times New Roman" w:cs="Times New Roman"/>
+          <w:sz w:val="28"/>
+          <w:szCs w:val="28"/>
+        </w:rPr>
+        <w:t>НАКАЗУЮ:</w:t>
+      </w:r>
     </w:p>
     <w:p>
       <w:pPr>
-        <w:spacing w:line="240" w:lineRule="auto"/>
-        <w:rPr>
-          <w:rFonts w:ascii="Times New Roman" w:hAnsi="Times New Roman" w:cs="Times New Roman"/>
-          <w:sz w:val="28"/>
-          <w:szCs w:val="28"/>
-          <w:lang w:val="en-US"/>
-        </w:rPr>
-      </w:pPr>
-    </w:p>
-    <w:p>
-      <w:pPr>
-        <w:spacing w:line="240" w:lineRule="auto"/>
-        <w:rPr>
-          <w:rFonts w:ascii="Times New Roman" w:hAnsi="Times New Roman" w:cs="Times New Roman"/>
-          <w:sz w:val="28"/>
-          <w:szCs w:val="28"/>
-        </w:rPr>
-      </w:pPr>
-      <w:r>
-        <w:rPr>
-          <w:rFonts w:ascii="Times New Roman" w:hAnsi="Times New Roman" w:cs="Times New Roman"/>
-          <w:sz w:val="28"/>
-          <w:szCs w:val="28"/>
-        </w:rPr>
-        <w:t>НАКАЗУЮ:</w:t>
-      </w:r>
-    </w:p>
-    <w:p>
-      <w:pPr>
-        <w:spacing w:line="240" w:lineRule="auto"/>
-        <w:rPr>
-          <w:rFonts w:ascii="Times New Roman" w:hAnsi="Times New Roman" w:cs="Times New Roman"/>
-          <w:sz w:val="28"/>
-          <w:szCs w:val="28"/>
-        </w:rPr>
-      </w:pPr>
-    </w:p>
-    <w:p>
-      <w:pPr>
-        <w:spacing w:line="240" w:lineRule="auto"/>
-        <w:rPr>
-          <w:rFonts w:ascii="Times New Roman" w:hAnsi="Times New Roman" w:cs="Times New Roman"/>
-          <w:sz w:val="28"/>
-          <w:szCs w:val="28"/>
-        </w:rPr>
-      </w:pPr>
-    </w:p>
-    <w:p>
-      <w:pPr>
-        <w:spacing w:after="0" w:line="240" w:lineRule="auto"/>
+        <w:spacing w:after="840" w:line="240" w:lineRule="auto"/>
         <w:rPr>
           <w:rFonts w:ascii="Times New Roman" w:eastAsia="Times New Roman" w:hAnsi="Times New Roman" w:cs="Times New Roman"/>
           <w:kern w:val="0"/>
           <w:sz w:val="28"/>
           <w:szCs w:val="28"/>
+          <w:lang w:val="uk-UA" w:eastAsia="ru-RU"/>
+          <w14:ligatures w14:val="none"/>
+        </w:rPr>
+      </w:pPr>
+      <w:r>
+        <w:rPr>
+          <w:rFonts w:ascii="Times New Roman" w:eastAsia="Times New Roman" w:hAnsi="Times New Roman" w:cs="Times New Roman"/>
+          <w:kern w:val="0"/>
+          <w:sz w:val="28"/>
+          <w:szCs w:val="28"/>
           <w:lang w:eastAsia="ru-RU"/>
           <w14:ligatures w14:val="none"/>
         </w:rPr>
-      </w:pPr>
+        <w:t>{</w:t>
+      </w:r>
+      <w:proofErr w:type="spellStart"/>
       <w:r>
         <w:rPr>
           <w:rFonts w:ascii="Times New Roman" w:eastAsia="Times New Roman" w:hAnsi="Times New Roman" w:cs="Times New Roman"/>
@@ -873,9 +795,9 @@
           <w:lang w:eastAsia="ru-RU"/>
           <w14:ligatures w14:val="none"/>
         </w:rPr>
-        <w:t>{</w:t>
-      </w:r>
-      <w:proofErr w:type="spellStart"/>
+        <w:t>directiveSection</w:t>
+      </w:r>
+      <w:proofErr w:type="spellEnd"/>
       <w:r>
         <w:rPr>
           <w:rFonts w:ascii="Times New Roman" w:eastAsia="Times New Roman" w:hAnsi="Times New Roman" w:cs="Times New Roman"/>
@@ -884,84 +806,6 @@
           <w:szCs w:val="28"/>
           <w:lang w:eastAsia="ru-RU"/>
           <w14:ligatures w14:val="none"/>
-        </w:rPr>
-        <w:t>directiveSection</w:t>
-      </w:r>
-      <w:proofErr w:type="spellEnd"/>
-      <w:r>
-        <w:rPr>
-          <w:rFonts w:ascii="Times New Roman" w:eastAsia="Times New Roman" w:hAnsi="Times New Roman" w:cs="Times New Roman"/>
-          <w:kern w:val="0"/>
-          <w:sz w:val="28"/>
-          <w:szCs w:val="28"/>
-          <w:lang w:eastAsia="ru-RU"/>
-          <w14:ligatures w14:val="none"/>
-        </w:rPr>
-        <w:t>}</w:t>
-      </w:r>
-    </w:p>
-    <w:p>
-      <w:pPr>
-        <w:spacing w:after="0" w:line="240" w:lineRule="auto"/>
-        <w:rPr>
-          <w:rFonts w:ascii="Times New Roman" w:eastAsia="Times New Roman" w:hAnsi="Times New Roman" w:cs="Times New Roman"/>
-          <w:kern w:val="0"/>
-          <w:sz w:val="28"/>
-          <w:szCs w:val="28"/>
-          <w:lang w:eastAsia="ru-RU"/>
-          <w14:ligatures w14:val="none"/>
-        </w:rPr>
-      </w:pPr>
-    </w:p>
-    <w:p>
-      <w:pPr>
-        <w:spacing w:after="0" w:line="240" w:lineRule="auto"/>
-        <w:rPr>
-          <w:rFonts w:ascii="Times New Roman" w:eastAsia="Times New Roman" w:hAnsi="Times New Roman" w:cs="Times New Roman"/>
-          <w:kern w:val="0"/>
-          <w:sz w:val="28"/>
-          <w:szCs w:val="28"/>
-          <w:lang w:eastAsia="ru-RU"/>
-          <w14:ligatures w14:val="none"/>
-        </w:rPr>
-      </w:pPr>
-    </w:p>
-    <w:p>
-      <w:pPr>
-        <w:spacing w:line="240" w:lineRule="auto"/>
-        <w:rPr>
-          <w:rFonts w:ascii="Times New Roman" w:hAnsi="Times New Roman" w:cs="Times New Roman"/>
-          <w:sz w:val="28"/>
-          <w:szCs w:val="28"/>
-          <w:lang w:val="uk-UA"/>
-        </w:rPr>
-      </w:pPr>
-      <w:r>
-        <w:rPr>
-          <w:rFonts w:ascii="Times New Roman" w:hAnsi="Times New Roman" w:cs="Times New Roman"/>
-          <w:sz w:val="28"/>
-          <w:szCs w:val="28"/>
-          <w:lang w:val="uk-UA"/>
-        </w:rPr>
-        <w:t>{</w:t>
-      </w:r>
-      <w:proofErr w:type="spellStart"/>
-      <w:r>
-        <w:rPr>
-          <w:rFonts w:ascii="Times New Roman" w:hAnsi="Times New Roman" w:cs="Times New Roman"/>
-          <w:sz w:val="28"/>
-          <w:szCs w:val="28"/>
-          <w:lang w:val="en-US"/>
-        </w:rPr>
-        <w:t>signerPosition</w:t>
-      </w:r>
-      <w:proofErr w:type="spellEnd"/>
-      <w:r>
-        <w:rPr>
-          <w:rFonts w:ascii="Times New Roman" w:hAnsi="Times New Roman" w:cs="Times New Roman"/>
-          <w:sz w:val="28"/>
-          <w:szCs w:val="28"/>
-          <w:lang w:val="uk-UA"/>
         </w:rPr>
         <w:t>}</w:t>
       </w:r>
@@ -970,19 +814,33 @@
       <w:tblPr>
         <w:tblStyle w:val="ac"/>
         <w:tblW w:w="0" w:type="auto"/>
+        <w:tblBorders>
+          <w:top w:val="none" w:sz="0" w:space="0" w:color="auto"/>
+          <w:left w:val="none" w:sz="0" w:space="0" w:color="auto"/>
+          <w:bottom w:val="none" w:sz="0" w:space="0" w:color="auto"/>
+          <w:right w:val="none" w:sz="0" w:space="0" w:color="auto"/>
+          <w:insideH w:val="none" w:sz="0" w:space="0" w:color="auto"/>
+          <w:insideV w:val="none" w:sz="0" w:space="0" w:color="auto"/>
+        </w:tblBorders>
         <w:tblLook w:val="04A0" w:firstRow="1" w:lastRow="0" w:firstColumn="1" w:lastColumn="0" w:noHBand="0" w:noVBand="1"/>
       </w:tblPr>
       <w:tblGrid>
-        <w:gridCol w:w="6971"/>
-        <w:gridCol w:w="2373"/>
+        <w:gridCol w:w="6708"/>
+        <w:gridCol w:w="2646"/>
       </w:tblGrid>
       <w:tr>
+        <w:trPr>
+          <w:cantSplit/>
+        </w:trPr>
         <w:tc>
           <w:tcPr>
-            <w:tcW w:w="7196" w:type="dxa"/>
+            <w:tcW w:w="9570" w:type="dxa"/>
+            <w:gridSpan w:val="2"/>
           </w:tcPr>
           <w:p>
             <w:pPr>
+              <w:keepNext/>
+              <w:keepLines/>
               <w:rPr>
                 <w:rFonts w:ascii="Times New Roman" w:hAnsi="Times New Roman" w:cs="Times New Roman"/>
                 <w:sz w:val="28"/>
@@ -997,7 +855,57 @@
                 <w:szCs w:val="28"/>
                 <w:lang w:val="uk-UA"/>
               </w:rPr>
-              <w:lastRenderedPageBreak/>
+              <w:t>{</w:t>
+            </w:r>
+            <w:proofErr w:type="spellStart"/>
+            <w:r>
+              <w:rPr>
+                <w:rFonts w:ascii="Times New Roman" w:hAnsi="Times New Roman" w:cs="Times New Roman"/>
+                <w:sz w:val="28"/>
+                <w:szCs w:val="28"/>
+                <w:lang w:val="en-US"/>
+              </w:rPr>
+              <w:t>signerPosition</w:t>
+            </w:r>
+            <w:proofErr w:type="spellEnd"/>
+            <w:r>
+              <w:rPr>
+                <w:rFonts w:ascii="Times New Roman" w:hAnsi="Times New Roman" w:cs="Times New Roman"/>
+                <w:sz w:val="28"/>
+                <w:szCs w:val="28"/>
+                <w:lang w:val="uk-UA"/>
+              </w:rPr>
+              <w:t>}</w:t>
+            </w:r>
+          </w:p>
+        </w:tc>
+      </w:tr>
+      <w:tr>
+        <w:trPr>
+          <w:cantSplit/>
+        </w:trPr>
+        <w:tc>
+          <w:tcPr>
+            <w:tcW w:w="6912" w:type="dxa"/>
+          </w:tcPr>
+          <w:p>
+            <w:pPr>
+              <w:keepNext/>
+              <w:keepLines/>
+              <w:rPr>
+                <w:rFonts w:ascii="Times New Roman" w:hAnsi="Times New Roman" w:cs="Times New Roman"/>
+                <w:sz w:val="28"/>
+                <w:szCs w:val="28"/>
+                <w:lang w:val="uk-UA"/>
+              </w:rPr>
+            </w:pPr>
+            <w:r>
+              <w:rPr>
+                <w:rFonts w:ascii="Times New Roman" w:hAnsi="Times New Roman" w:cs="Times New Roman"/>
+                <w:sz w:val="28"/>
+                <w:szCs w:val="28"/>
+                <w:lang w:val="uk-UA"/>
+              </w:rPr>
               <w:t>{</w:t>
             </w:r>
             <w:proofErr w:type="spellStart"/>
@@ -1023,11 +931,13 @@
         </w:tc>
         <w:tc>
           <w:tcPr>
-            <w:tcW w:w="2374" w:type="dxa"/>
+            <w:tcW w:w="2658" w:type="dxa"/>
             <w:vAlign w:val="center"/>
           </w:tcPr>
           <w:p>
             <w:pPr>
+              <w:keepNext/>
+              <w:keepLines/>
               <w:jc w:val="right"/>
               <w:rPr>
                 <w:rFonts w:ascii="Times New Roman" w:hAnsi="Times New Roman" w:cs="Times New Roman"/>
@@ -1097,6 +1007,337 @@
                 <w:rFonts w:ascii="Times New Roman" w:hAnsi="Times New Roman" w:cs="Times New Roman"/>
                 <w:sz w:val="28"/>
                 <w:szCs w:val="28"/>
+                <w:lang w:val="uk-UA"/>
+              </w:rPr>
+              <w:t>}</w:t>
+            </w:r>
+          </w:p>
+        </w:tc>
+      </w:tr>
+    </w:tbl>
+    <w:p>
+      <w:pPr>
+        <w:rPr>
+          <w:rFonts w:ascii="Times New Roman" w:hAnsi="Times New Roman" w:cs="Times New Roman"/>
+          <w:sz w:val="28"/>
+          <w:szCs w:val="28"/>
+          <w:lang w:val="uk-UA"/>
+        </w:rPr>
+      </w:pPr>
+      <w:r>
+        <w:rPr>
+          <w:rFonts w:ascii="Times New Roman" w:hAnsi="Times New Roman" w:cs="Times New Roman"/>
+          <w:sz w:val="28"/>
+          <w:szCs w:val="28"/>
+          <w:lang w:val="uk-UA"/>
+        </w:rPr>
+        <w:br w:type="page"/>
+      </w:r>
+    </w:p>
+    <w:p>
+      <w:pPr>
+        <w:rPr>
+          <w:rFonts w:ascii="Times New Roman" w:hAnsi="Times New Roman" w:cs="Times New Roman"/>
+          <w:sz w:val="24"/>
+          <w:szCs w:val="24"/>
+          <w:lang w:val="uk-UA"/>
+        </w:rPr>
+      </w:pPr>
+      <w:r>
+        <w:rPr>
+          <w:rFonts w:ascii="Times New Roman" w:hAnsi="Times New Roman" w:cs="Times New Roman"/>
+          <w:sz w:val="24"/>
+          <w:szCs w:val="24"/>
+          <w:lang w:val="uk-UA"/>
+        </w:rPr>
+        <w:lastRenderedPageBreak/>
+        <w:t>{#approvals}</w:t>
+      </w:r>
+    </w:p>
+    <w:tbl>
+      <w:tblPr>
+        <w:tblStyle w:val="ac"/>
+        <w:tblW w:w="0" w:type="auto"/>
+        <w:tblBorders>
+          <w:top w:val="none" w:sz="0" w:space="0" w:color="auto"/>
+          <w:left w:val="none" w:sz="0" w:space="0" w:color="auto"/>
+          <w:bottom w:val="none" w:sz="0" w:space="0" w:color="auto"/>
+          <w:right w:val="none" w:sz="0" w:space="0" w:color="auto"/>
+          <w:insideH w:val="none" w:sz="0" w:space="0" w:color="auto"/>
+          <w:insideV w:val="none" w:sz="0" w:space="0" w:color="auto"/>
+        </w:tblBorders>
+        <w:tblLook w:val="04A0" w:firstRow="1" w:lastRow="0" w:firstColumn="1" w:lastColumn="0" w:noHBand="0" w:noVBand="1"/>
+      </w:tblPr>
+      <w:tblGrid>
+        <w:gridCol w:w="6782"/>
+        <w:gridCol w:w="2572"/>
+      </w:tblGrid>
+      <w:tr>
+        <w:trPr>
+          <w:cantSplit/>
+          <w:trHeight w:val="300"/>
+        </w:trPr>
+        <w:tc>
+          <w:tcPr>
+            <w:tcW w:w="9570" w:type="dxa"/>
+            <w:gridSpan w:val="2"/>
+          </w:tcPr>
+          <w:p>
+            <w:pPr>
+              <w:keepNext/>
+              <w:keepLines/>
+              <w:rPr>
+                <w:rFonts w:ascii="Times New Roman" w:hAnsi="Times New Roman" w:cs="Times New Roman"/>
+                <w:sz w:val="24"/>
+                <w:szCs w:val="24"/>
+                <w:lang w:val="uk-UA"/>
+              </w:rPr>
+            </w:pPr>
+            <w:r>
+              <w:rPr>
+                <w:rFonts w:ascii="Times New Roman" w:hAnsi="Times New Roman" w:cs="Times New Roman"/>
+                <w:sz w:val="24"/>
+                <w:szCs w:val="24"/>
+                <w:lang w:val="uk-UA"/>
+              </w:rPr>
+              <w:t>Погоджено:</w:t>
+            </w:r>
+          </w:p>
+        </w:tc>
+      </w:tr>
+      <w:tr>
+        <w:trPr>
+          <w:cantSplit/>
+          <w:trHeight w:val="300"/>
+        </w:trPr>
+        <w:tc>
+          <w:tcPr>
+            <w:tcW w:w="9570" w:type="dxa"/>
+            <w:gridSpan w:val="2"/>
+          </w:tcPr>
+          <w:p>
+            <w:pPr>
+              <w:keepNext/>
+              <w:keepLines/>
+              <w:rPr>
+                <w:rFonts w:ascii="Times New Roman" w:hAnsi="Times New Roman" w:cs="Times New Roman"/>
+                <w:sz w:val="24"/>
+                <w:szCs w:val="24"/>
+                <w:lang w:val="uk-UA"/>
+              </w:rPr>
+            </w:pPr>
+            <w:r>
+              <w:rPr>
+                <w:rFonts w:ascii="Times New Roman" w:hAnsi="Times New Roman" w:cs="Times New Roman"/>
+                <w:sz w:val="24"/>
+                <w:szCs w:val="24"/>
+                <w:lang w:val="uk-UA"/>
+              </w:rPr>
+              <w:t>{</w:t>
+            </w:r>
+            <w:proofErr w:type="spellStart"/>
+            <w:r>
+              <w:rPr>
+                <w:rFonts w:ascii="Times New Roman" w:hAnsi="Times New Roman" w:cs="Times New Roman"/>
+                <w:sz w:val="24"/>
+                <w:szCs w:val="24"/>
+                <w:lang w:val="uk-UA"/>
+              </w:rPr>
+              <w:t>position</w:t>
+            </w:r>
+            <w:proofErr w:type="spellEnd"/>
+            <w:r>
+              <w:rPr>
+                <w:rFonts w:ascii="Times New Roman" w:hAnsi="Times New Roman" w:cs="Times New Roman"/>
+                <w:sz w:val="24"/>
+                <w:szCs w:val="24"/>
+                <w:lang w:val="uk-UA"/>
+              </w:rPr>
+              <w:t>}</w:t>
+            </w:r>
+          </w:p>
+        </w:tc>
+      </w:tr>
+      <w:tr>
+        <w:trPr>
+          <w:cantSplit/>
+          <w:trHeight w:val="300"/>
+        </w:trPr>
+        <w:tc>
+          <w:tcPr>
+            <w:tcW w:w="6912" w:type="dxa"/>
+          </w:tcPr>
+          <w:p>
+            <w:pPr>
+              <w:keepLines/>
+              <w:rPr>
+                <w:rFonts w:ascii="Times New Roman" w:hAnsi="Times New Roman" w:cs="Times New Roman"/>
+                <w:sz w:val="24"/>
+                <w:szCs w:val="24"/>
+                <w:lang w:val="uk-UA"/>
+              </w:rPr>
+            </w:pPr>
+            <w:r>
+              <w:rPr>
+                <w:rFonts w:ascii="Times New Roman" w:hAnsi="Times New Roman" w:cs="Times New Roman"/>
+                <w:sz w:val="24"/>
+                <w:szCs w:val="24"/>
+                <w:lang w:val="uk-UA"/>
+              </w:rPr>
+              <w:t>{</w:t>
+            </w:r>
+            <w:proofErr w:type="spellStart"/>
+            <w:r>
+              <w:rPr>
+                <w:rFonts w:ascii="Times New Roman" w:hAnsi="Times New Roman" w:cs="Times New Roman"/>
+                <w:sz w:val="24"/>
+                <w:szCs w:val="24"/>
+                <w:lang w:val="uk-UA"/>
+              </w:rPr>
+              <w:t>rank</w:t>
+            </w:r>
+            <w:proofErr w:type="spellEnd"/>
+            <w:r>
+              <w:rPr>
+                <w:rFonts w:ascii="Times New Roman" w:hAnsi="Times New Roman" w:cs="Times New Roman"/>
+                <w:sz w:val="24"/>
+                <w:szCs w:val="24"/>
+                <w:lang w:val="uk-UA"/>
+              </w:rPr>
+              <w:t>}</w:t>
+            </w:r>
+            <w:r>
+              <w:rPr>
+                <w:rFonts w:ascii="Times New Roman" w:hAnsi="Times New Roman" w:cs="Times New Roman"/>
+                <w:sz w:val="24"/>
+                <w:szCs w:val="24"/>
+                <w:lang w:val="uk-UA"/>
+              </w:rPr>
+              <w:br/>
+              <w:t>{</w:t>
+            </w:r>
+            <w:proofErr w:type="spellStart"/>
+            <w:r>
+              <w:rPr>
+                <w:rFonts w:ascii="Times New Roman" w:hAnsi="Times New Roman" w:cs="Times New Roman"/>
+                <w:sz w:val="24"/>
+                <w:szCs w:val="24"/>
+                <w:lang w:val="uk-UA"/>
+              </w:rPr>
+              <w:t>approvalDay</w:t>
+            </w:r>
+            <w:proofErr w:type="spellEnd"/>
+            <w:r>
+              <w:rPr>
+                <w:rFonts w:ascii="Times New Roman" w:hAnsi="Times New Roman" w:cs="Times New Roman"/>
+                <w:sz w:val="24"/>
+                <w:szCs w:val="24"/>
+                <w:lang w:val="uk-UA"/>
+              </w:rPr>
+              <w:t>}.{</w:t>
+            </w:r>
+            <w:proofErr w:type="spellStart"/>
+            <w:r>
+              <w:rPr>
+                <w:rFonts w:ascii="Times New Roman" w:hAnsi="Times New Roman" w:cs="Times New Roman"/>
+                <w:sz w:val="24"/>
+                <w:szCs w:val="24"/>
+                <w:lang w:val="uk-UA"/>
+              </w:rPr>
+              <w:t>approvalMonth</w:t>
+            </w:r>
+            <w:proofErr w:type="spellEnd"/>
+            <w:r>
+              <w:rPr>
+                <w:rFonts w:ascii="Times New Roman" w:hAnsi="Times New Roman" w:cs="Times New Roman"/>
+                <w:sz w:val="24"/>
+                <w:szCs w:val="24"/>
+                <w:lang w:val="uk-UA"/>
+              </w:rPr>
+              <w:t>}.{</w:t>
+            </w:r>
+            <w:proofErr w:type="spellStart"/>
+            <w:r>
+              <w:rPr>
+                <w:rFonts w:ascii="Times New Roman" w:hAnsi="Times New Roman" w:cs="Times New Roman"/>
+                <w:sz w:val="24"/>
+                <w:szCs w:val="24"/>
+                <w:lang w:val="uk-UA"/>
+              </w:rPr>
+              <w:t>approvalYear</w:t>
+            </w:r>
+            <w:proofErr w:type="spellEnd"/>
+            <w:r>
+              <w:rPr>
+                <w:rFonts w:ascii="Times New Roman" w:hAnsi="Times New Roman" w:cs="Times New Roman"/>
+                <w:sz w:val="24"/>
+                <w:szCs w:val="24"/>
+                <w:lang w:val="uk-UA"/>
+              </w:rPr>
+              <w:t>}</w:t>
+            </w:r>
+          </w:p>
+        </w:tc>
+        <w:tc>
+          <w:tcPr>
+            <w:tcW w:w="2658" w:type="dxa"/>
+          </w:tcPr>
+          <w:p>
+            <w:pPr>
+              <w:keepLines/>
+              <w:jc w:val="right"/>
+              <w:rPr>
+                <w:rFonts w:ascii="Times New Roman" w:hAnsi="Times New Roman" w:cs="Times New Roman"/>
+                <w:sz w:val="24"/>
+                <w:szCs w:val="24"/>
+                <w:lang w:val="uk-UA"/>
+              </w:rPr>
+            </w:pPr>
+            <w:r>
+              <w:rPr>
+                <w:rFonts w:ascii="Times New Roman" w:hAnsi="Times New Roman" w:cs="Times New Roman"/>
+                <w:sz w:val="24"/>
+                <w:szCs w:val="24"/>
+                <w:lang w:val="uk-UA"/>
+              </w:rPr>
+              <w:t>{</w:t>
+            </w:r>
+            <w:proofErr w:type="spellStart"/>
+            <w:r>
+              <w:rPr>
+                <w:rFonts w:ascii="Times New Roman" w:hAnsi="Times New Roman" w:cs="Times New Roman"/>
+                <w:sz w:val="24"/>
+                <w:szCs w:val="24"/>
+                <w:lang w:val="uk-UA"/>
+              </w:rPr>
+              <w:t>firstName</w:t>
+            </w:r>
+            <w:proofErr w:type="spellEnd"/>
+            <w:r>
+              <w:rPr>
+                <w:rFonts w:ascii="Times New Roman" w:hAnsi="Times New Roman" w:cs="Times New Roman"/>
+                <w:sz w:val="24"/>
+                <w:szCs w:val="24"/>
+                <w:lang w:val="uk-UA"/>
+              </w:rPr>
+              <w:t>} {</w:t>
+            </w:r>
+            <w:proofErr w:type="spellStart"/>
+            <w:r>
+              <w:rPr>
+                <w:rFonts w:ascii="Times New Roman" w:hAnsi="Times New Roman" w:cs="Times New Roman"/>
+                <w:sz w:val="24"/>
+                <w:szCs w:val="24"/>
+                <w:lang w:val="uk-UA"/>
+              </w:rPr>
+              <w:t>lastName</w:t>
+            </w:r>
+            <w:proofErr w:type="spellEnd"/>
+            <w:r>
+              <w:rPr>
+                <w:rFonts w:ascii="Times New Roman" w:hAnsi="Times New Roman" w:cs="Times New Roman"/>
+                <w:sz w:val="24"/>
+                <w:szCs w:val="24"/>
                 <w:lang w:val="uk-UA"/>
               </w:rPr>
               <w:t>}</w:t>
@@ -1109,172 +1350,478 @@
       <w:pPr>
         <w:spacing w:line="240" w:lineRule="auto"/>
         <w:rPr>
-          <w:rFonts w:ascii="Times New Roman" w:eastAsia="Times New Roman" w:hAnsi="Times New Roman" w:cs="Times New Roman"/>
-          <w:kern w:val="0"/>
-          <w:sz w:val="28"/>
-          <w:szCs w:val="28"/>
-          <w:lang w:val="uk-UA" w:eastAsia="ru-RU"/>
-          <w14:ligatures w14:val="none"/>
+          <w:rFonts w:ascii="Times New Roman" w:hAnsi="Times New Roman" w:cs="Times New Roman"/>
+          <w:sz w:val="24"/>
+          <w:szCs w:val="24"/>
+          <w:lang w:val="uk-UA"/>
         </w:rPr>
       </w:pPr>
+      <w:r>
+        <w:rPr>
+          <w:rFonts w:ascii="Times New Roman" w:hAnsi="Times New Roman" w:cs="Times New Roman"/>
+          <w:sz w:val="24"/>
+          <w:szCs w:val="24"/>
+          <w:lang w:val="uk-UA"/>
+        </w:rPr>
+        <w:t>{/</w:t>
+      </w:r>
       <w:proofErr w:type="spellStart"/>
       <w:r>
         <w:rPr>
-          <w:rFonts w:ascii="Times New Roman" w:eastAsia="Times New Roman" w:hAnsi="Times New Roman" w:cs="Times New Roman"/>
-          <w:kern w:val="0"/>
-          <w:sz w:val="28"/>
-          <w:szCs w:val="28"/>
-          <w:lang w:eastAsia="ru-RU"/>
-          <w14:ligatures w14:val="none"/>
-        </w:rPr>
-        <w:t>Поставити</w:t>
+          <w:rFonts w:ascii="Times New Roman" w:hAnsi="Times New Roman" w:cs="Times New Roman"/>
+          <w:sz w:val="24"/>
+          <w:szCs w:val="24"/>
+          <w:lang w:val="uk-UA"/>
+        </w:rPr>
+        <w:t>approvals</w:t>
       </w:r>
       <w:proofErr w:type="spellEnd"/>
       <w:r>
         <w:rPr>
-          <w:rFonts w:ascii="Times New Roman" w:eastAsia="Times New Roman" w:hAnsi="Times New Roman" w:cs="Times New Roman"/>
-          <w:kern w:val="0"/>
-          <w:sz w:val="28"/>
-          <w:szCs w:val="28"/>
-          <w:lang w:eastAsia="ru-RU"/>
-          <w14:ligatures w14:val="none"/>
-        </w:rPr>
-        <w:t xml:space="preserve"> </w:t>
-      </w:r>
-      <w:proofErr w:type="spellStart"/>
-      <w:r>
-        <w:rPr>
-          <w:rFonts w:ascii="Times New Roman" w:eastAsia="Times New Roman" w:hAnsi="Times New Roman" w:cs="Times New Roman"/>
-          <w:kern w:val="0"/>
-          <w:sz w:val="28"/>
-          <w:szCs w:val="28"/>
-          <w:lang w:eastAsia="ru-RU"/>
-          <w14:ligatures w14:val="none"/>
-        </w:rPr>
-        <w:t>розрив</w:t>
-      </w:r>
-      <w:proofErr w:type="spellEnd"/>
-      <w:r>
-        <w:rPr>
-          <w:rFonts w:ascii="Times New Roman" w:eastAsia="Times New Roman" w:hAnsi="Times New Roman" w:cs="Times New Roman"/>
-          <w:kern w:val="0"/>
-          <w:sz w:val="28"/>
-          <w:szCs w:val="28"/>
-          <w:lang w:eastAsia="ru-RU"/>
-          <w14:ligatures w14:val="none"/>
-        </w:rPr>
-        <w:t xml:space="preserve"> стор</w:t>
-      </w:r>
-      <w:r>
-        <w:rPr>
-          <w:rFonts w:ascii="Times New Roman" w:eastAsia="Times New Roman" w:hAnsi="Times New Roman" w:cs="Times New Roman"/>
-          <w:kern w:val="0"/>
-          <w:sz w:val="28"/>
-          <w:szCs w:val="28"/>
-          <w:lang w:val="uk-UA" w:eastAsia="ru-RU"/>
-          <w14:ligatures w14:val="none"/>
-        </w:rPr>
-        <w:t>інки</w:t>
+          <w:rFonts w:ascii="Times New Roman" w:hAnsi="Times New Roman" w:cs="Times New Roman"/>
+          <w:sz w:val="24"/>
+          <w:szCs w:val="24"/>
+          <w:lang w:val="uk-UA"/>
+        </w:rPr>
+        <w:t>}</w:t>
       </w:r>
     </w:p>
     <w:p>
       <w:pPr>
-        <w:spacing w:line="240" w:lineRule="auto"/>
-        <w:rPr>
-          <w:rFonts w:ascii="Times New Roman" w:hAnsi="Times New Roman" w:cs="Times New Roman"/>
-          <w:sz w:val="28"/>
-          <w:szCs w:val="28"/>
-          <w:lang w:val="uk-UA"/>
+        <w:tabs>
+          <w:tab w:val="left" w:pos="142"/>
+        </w:tabs>
+        <w:spacing w:before="360" w:after="360" w:line="240" w:lineRule="auto"/>
+        <w:jc w:val="both"/>
+        <w:rPr>
+          <w:rFonts w:ascii="Times New Roman" w:hAnsi="Times New Roman" w:cs="Times New Roman"/>
+          <w:sz w:val="24"/>
+          <w:szCs w:val="24"/>
         </w:rPr>
       </w:pPr>
-      <w:r>
-        <w:rPr>
-          <w:rFonts w:ascii="Times New Roman" w:hAnsi="Times New Roman" w:cs="Times New Roman"/>
-          <w:sz w:val="28"/>
-          <w:szCs w:val="28"/>
-          <w:lang w:val="uk-UA"/>
-        </w:rPr>
-        <w:t>Погоджено:</w:t>
-      </w:r>
-      <w:r>
-        <w:rPr>
-          <w:rFonts w:ascii="Times New Roman" w:hAnsi="Times New Roman" w:cs="Times New Roman"/>
-          <w:sz w:val="28"/>
-          <w:szCs w:val="28"/>
-          <w:lang w:val="uk-UA"/>
-        </w:rPr>
-        <w:t>{#approvals}</w:t>
-      </w:r>
-    </w:p>
-    <w:p>
-      <w:pPr>
-        <w:spacing w:line="240" w:lineRule="auto"/>
-        <w:rPr>
-          <w:rFonts w:ascii="Times New Roman" w:hAnsi="Times New Roman" w:cs="Times New Roman"/>
-          <w:sz w:val="28"/>
-          <w:szCs w:val="28"/>
-          <w:lang w:val="uk-UA"/>
-        </w:rPr>
-      </w:pPr>
-      <w:r>
-        <w:rPr>
-          <w:rFonts w:ascii="Times New Roman" w:hAnsi="Times New Roman" w:cs="Times New Roman"/>
-          <w:sz w:val="28"/>
-          <w:szCs w:val="28"/>
-          <w:lang w:val="uk-UA"/>
-        </w:rPr>
-        <w:t>{</w:t>
-      </w:r>
       <w:proofErr w:type="spellStart"/>
       <w:r>
         <w:rPr>
           <w:rFonts w:ascii="Times New Roman" w:hAnsi="Times New Roman" w:cs="Times New Roman"/>
-          <w:sz w:val="28"/>
-          <w:szCs w:val="28"/>
-          <w:lang w:val="uk-UA"/>
-        </w:rPr>
-        <w:t>position</w:t>
+          <w:sz w:val="24"/>
+          <w:szCs w:val="24"/>
+        </w:rPr>
+        <w:t>Зміст</w:t>
       </w:r>
       <w:proofErr w:type="spellEnd"/>
       <w:r>
         <w:rPr>
           <w:rFonts w:ascii="Times New Roman" w:hAnsi="Times New Roman" w:cs="Times New Roman"/>
-          <w:sz w:val="28"/>
-          <w:szCs w:val="28"/>
-          <w:lang w:val="uk-UA"/>
-        </w:rPr>
-        <w:t>}</w:t>
+          <w:sz w:val="24"/>
+          <w:szCs w:val="24"/>
+        </w:rPr>
+        <w:t xml:space="preserve"> документа </w:t>
+      </w:r>
+      <w:proofErr w:type="spellStart"/>
+      <w:r>
+        <w:rPr>
+          <w:rFonts w:ascii="Times New Roman" w:hAnsi="Times New Roman" w:cs="Times New Roman"/>
+          <w:sz w:val="24"/>
+          <w:szCs w:val="24"/>
+        </w:rPr>
+        <w:t>вимогам</w:t>
+      </w:r>
+      <w:proofErr w:type="spellEnd"/>
+      <w:r>
+        <w:rPr>
+          <w:rFonts w:ascii="Times New Roman" w:hAnsi="Times New Roman" w:cs="Times New Roman"/>
+          <w:sz w:val="24"/>
+          <w:szCs w:val="24"/>
+        </w:rPr>
+        <w:t xml:space="preserve"> чинного </w:t>
+      </w:r>
+      <w:proofErr w:type="spellStart"/>
+      <w:r>
+        <w:rPr>
+          <w:rFonts w:ascii="Times New Roman" w:hAnsi="Times New Roman" w:cs="Times New Roman"/>
+          <w:sz w:val="24"/>
+          <w:szCs w:val="24"/>
+        </w:rPr>
+        <w:t>законодавства</w:t>
+      </w:r>
+      <w:proofErr w:type="spellEnd"/>
+      <w:r>
+        <w:rPr>
+          <w:rFonts w:ascii="Times New Roman" w:hAnsi="Times New Roman" w:cs="Times New Roman"/>
+          <w:sz w:val="24"/>
+          <w:szCs w:val="24"/>
+        </w:rPr>
+        <w:t xml:space="preserve"> </w:t>
+      </w:r>
+      <w:proofErr w:type="spellStart"/>
+      <w:r>
+        <w:rPr>
+          <w:rFonts w:ascii="Times New Roman" w:hAnsi="Times New Roman" w:cs="Times New Roman"/>
+          <w:sz w:val="24"/>
+          <w:szCs w:val="24"/>
+        </w:rPr>
+        <w:t>відповідає</w:t>
+      </w:r>
+      <w:proofErr w:type="spellEnd"/>
+      <w:r>
+        <w:rPr>
+          <w:rFonts w:ascii="Times New Roman" w:hAnsi="Times New Roman" w:cs="Times New Roman"/>
+          <w:sz w:val="24"/>
+          <w:szCs w:val="24"/>
+        </w:rPr>
+        <w:t xml:space="preserve">. </w:t>
+      </w:r>
+      <w:proofErr w:type="spellStart"/>
+      <w:r>
+        <w:rPr>
+          <w:rFonts w:ascii="Times New Roman" w:hAnsi="Times New Roman" w:cs="Times New Roman"/>
+          <w:sz w:val="24"/>
+          <w:szCs w:val="24"/>
+        </w:rPr>
+        <w:t>Негативних</w:t>
+      </w:r>
+      <w:proofErr w:type="spellEnd"/>
+      <w:r>
+        <w:rPr>
+          <w:rFonts w:ascii="Times New Roman" w:hAnsi="Times New Roman" w:cs="Times New Roman"/>
+          <w:sz w:val="24"/>
+          <w:szCs w:val="24"/>
+        </w:rPr>
+        <w:t xml:space="preserve"> </w:t>
+      </w:r>
+      <w:proofErr w:type="spellStart"/>
+      <w:r>
+        <w:rPr>
+          <w:rFonts w:ascii="Times New Roman" w:hAnsi="Times New Roman" w:cs="Times New Roman"/>
+          <w:sz w:val="24"/>
+          <w:szCs w:val="24"/>
+        </w:rPr>
+        <w:t>правових</w:t>
+      </w:r>
+      <w:proofErr w:type="spellEnd"/>
+      <w:r>
+        <w:rPr>
+          <w:rFonts w:ascii="Times New Roman" w:hAnsi="Times New Roman" w:cs="Times New Roman"/>
+          <w:sz w:val="24"/>
+          <w:szCs w:val="24"/>
+        </w:rPr>
+        <w:t xml:space="preserve"> </w:t>
+      </w:r>
+      <w:proofErr w:type="spellStart"/>
+      <w:r>
+        <w:rPr>
+          <w:rFonts w:ascii="Times New Roman" w:hAnsi="Times New Roman" w:cs="Times New Roman"/>
+          <w:sz w:val="24"/>
+          <w:szCs w:val="24"/>
+        </w:rPr>
+        <w:t>наслідків</w:t>
+      </w:r>
+      <w:proofErr w:type="spellEnd"/>
+      <w:r>
+        <w:rPr>
+          <w:rFonts w:ascii="Times New Roman" w:hAnsi="Times New Roman" w:cs="Times New Roman"/>
+          <w:sz w:val="24"/>
+          <w:szCs w:val="24"/>
+        </w:rPr>
+        <w:t xml:space="preserve"> </w:t>
+      </w:r>
+      <w:proofErr w:type="spellStart"/>
+      <w:r>
+        <w:rPr>
+          <w:rFonts w:ascii="Times New Roman" w:hAnsi="Times New Roman" w:cs="Times New Roman"/>
+          <w:sz w:val="24"/>
+          <w:szCs w:val="24"/>
+        </w:rPr>
+        <w:t>реалізації</w:t>
+      </w:r>
+      <w:proofErr w:type="spellEnd"/>
+      <w:r>
+        <w:rPr>
+          <w:rFonts w:ascii="Times New Roman" w:hAnsi="Times New Roman" w:cs="Times New Roman"/>
+          <w:sz w:val="24"/>
+          <w:szCs w:val="24"/>
+        </w:rPr>
+        <w:t xml:space="preserve"> </w:t>
+      </w:r>
+      <w:proofErr w:type="spellStart"/>
+      <w:r>
+        <w:rPr>
+          <w:rFonts w:ascii="Times New Roman" w:hAnsi="Times New Roman" w:cs="Times New Roman"/>
+          <w:sz w:val="24"/>
+          <w:szCs w:val="24"/>
+        </w:rPr>
+        <w:t>положень</w:t>
+      </w:r>
+      <w:proofErr w:type="spellEnd"/>
+      <w:r>
+        <w:rPr>
+          <w:rFonts w:ascii="Times New Roman" w:hAnsi="Times New Roman" w:cs="Times New Roman"/>
+          <w:sz w:val="24"/>
+          <w:szCs w:val="24"/>
+        </w:rPr>
+        <w:t xml:space="preserve"> документа, у тому </w:t>
+      </w:r>
+      <w:proofErr w:type="spellStart"/>
+      <w:r>
+        <w:rPr>
+          <w:rFonts w:ascii="Times New Roman" w:hAnsi="Times New Roman" w:cs="Times New Roman"/>
+          <w:sz w:val="24"/>
+          <w:szCs w:val="24"/>
+        </w:rPr>
+        <w:t>числі</w:t>
+      </w:r>
+      <w:proofErr w:type="spellEnd"/>
+      <w:r>
+        <w:rPr>
+          <w:rFonts w:ascii="Times New Roman" w:hAnsi="Times New Roman" w:cs="Times New Roman"/>
+          <w:sz w:val="24"/>
+          <w:szCs w:val="24"/>
+        </w:rPr>
+        <w:t xml:space="preserve"> </w:t>
+      </w:r>
+      <w:proofErr w:type="spellStart"/>
+      <w:r>
+        <w:rPr>
+          <w:rFonts w:ascii="Times New Roman" w:hAnsi="Times New Roman" w:cs="Times New Roman"/>
+          <w:sz w:val="24"/>
+          <w:szCs w:val="24"/>
+        </w:rPr>
+        <w:t>порушень</w:t>
+      </w:r>
+      <w:proofErr w:type="spellEnd"/>
+      <w:r>
+        <w:rPr>
+          <w:rFonts w:ascii="Times New Roman" w:hAnsi="Times New Roman" w:cs="Times New Roman"/>
+          <w:sz w:val="24"/>
+          <w:szCs w:val="24"/>
+        </w:rPr>
+        <w:t xml:space="preserve"> </w:t>
+      </w:r>
+      <w:proofErr w:type="spellStart"/>
+      <w:r>
+        <w:rPr>
+          <w:rFonts w:ascii="Times New Roman" w:hAnsi="Times New Roman" w:cs="Times New Roman"/>
+          <w:sz w:val="24"/>
+          <w:szCs w:val="24"/>
+        </w:rPr>
+        <w:t>законодавства</w:t>
+      </w:r>
+      <w:proofErr w:type="spellEnd"/>
+      <w:r>
+        <w:rPr>
+          <w:rFonts w:ascii="Times New Roman" w:hAnsi="Times New Roman" w:cs="Times New Roman"/>
+          <w:sz w:val="24"/>
+          <w:szCs w:val="24"/>
+        </w:rPr>
+        <w:t xml:space="preserve">, </w:t>
+      </w:r>
+      <w:proofErr w:type="spellStart"/>
+      <w:r>
+        <w:rPr>
+          <w:rFonts w:ascii="Times New Roman" w:hAnsi="Times New Roman" w:cs="Times New Roman"/>
+          <w:sz w:val="24"/>
+          <w:szCs w:val="24"/>
+        </w:rPr>
+        <w:t>що</w:t>
+      </w:r>
+      <w:proofErr w:type="spellEnd"/>
+      <w:r>
+        <w:rPr>
+          <w:rFonts w:ascii="Times New Roman" w:hAnsi="Times New Roman" w:cs="Times New Roman"/>
+          <w:sz w:val="24"/>
+          <w:szCs w:val="24"/>
+        </w:rPr>
+        <w:t xml:space="preserve"> </w:t>
+      </w:r>
+      <w:proofErr w:type="spellStart"/>
+      <w:r>
+        <w:rPr>
+          <w:rFonts w:ascii="Times New Roman" w:hAnsi="Times New Roman" w:cs="Times New Roman"/>
+          <w:sz w:val="24"/>
+          <w:szCs w:val="24"/>
+        </w:rPr>
+        <w:t>можуть</w:t>
+      </w:r>
+      <w:proofErr w:type="spellEnd"/>
+      <w:r>
+        <w:rPr>
+          <w:rFonts w:ascii="Times New Roman" w:hAnsi="Times New Roman" w:cs="Times New Roman"/>
+          <w:sz w:val="24"/>
+          <w:szCs w:val="24"/>
+        </w:rPr>
+        <w:t xml:space="preserve"> </w:t>
+      </w:r>
+      <w:proofErr w:type="spellStart"/>
+      <w:r>
+        <w:rPr>
+          <w:rFonts w:ascii="Times New Roman" w:hAnsi="Times New Roman" w:cs="Times New Roman"/>
+          <w:sz w:val="24"/>
+          <w:szCs w:val="24"/>
+        </w:rPr>
+        <w:t>створити</w:t>
+      </w:r>
+      <w:proofErr w:type="spellEnd"/>
+      <w:r>
+        <w:rPr>
+          <w:rFonts w:ascii="Times New Roman" w:hAnsi="Times New Roman" w:cs="Times New Roman"/>
+          <w:sz w:val="24"/>
+          <w:szCs w:val="24"/>
+        </w:rPr>
+        <w:t xml:space="preserve"> </w:t>
+      </w:r>
+      <w:proofErr w:type="spellStart"/>
+      <w:r>
+        <w:rPr>
+          <w:rFonts w:ascii="Times New Roman" w:hAnsi="Times New Roman" w:cs="Times New Roman"/>
+          <w:sz w:val="24"/>
+          <w:szCs w:val="24"/>
+        </w:rPr>
+        <w:t>передумови</w:t>
+      </w:r>
+      <w:proofErr w:type="spellEnd"/>
+      <w:r>
+        <w:rPr>
+          <w:rFonts w:ascii="Times New Roman" w:hAnsi="Times New Roman" w:cs="Times New Roman"/>
+          <w:sz w:val="24"/>
+          <w:szCs w:val="24"/>
+        </w:rPr>
+        <w:t xml:space="preserve"> для </w:t>
+      </w:r>
+      <w:proofErr w:type="spellStart"/>
+      <w:r>
+        <w:rPr>
+          <w:rFonts w:ascii="Times New Roman" w:hAnsi="Times New Roman" w:cs="Times New Roman"/>
+          <w:sz w:val="24"/>
+          <w:szCs w:val="24"/>
+        </w:rPr>
+        <w:t>нанесення</w:t>
+      </w:r>
+      <w:proofErr w:type="spellEnd"/>
+      <w:r>
+        <w:rPr>
+          <w:rFonts w:ascii="Times New Roman" w:hAnsi="Times New Roman" w:cs="Times New Roman"/>
+          <w:sz w:val="24"/>
+          <w:szCs w:val="24"/>
+        </w:rPr>
+        <w:t xml:space="preserve"> </w:t>
+      </w:r>
+      <w:proofErr w:type="spellStart"/>
+      <w:r>
+        <w:rPr>
+          <w:rFonts w:ascii="Times New Roman" w:hAnsi="Times New Roman" w:cs="Times New Roman"/>
+          <w:sz w:val="24"/>
+          <w:szCs w:val="24"/>
+        </w:rPr>
+        <w:t>економічних</w:t>
+      </w:r>
+      <w:proofErr w:type="spellEnd"/>
+      <w:r>
+        <w:rPr>
+          <w:rFonts w:ascii="Times New Roman" w:hAnsi="Times New Roman" w:cs="Times New Roman"/>
+          <w:sz w:val="24"/>
+          <w:szCs w:val="24"/>
+        </w:rPr>
+        <w:t xml:space="preserve"> </w:t>
+      </w:r>
+      <w:proofErr w:type="spellStart"/>
+      <w:r>
+        <w:rPr>
+          <w:rFonts w:ascii="Times New Roman" w:hAnsi="Times New Roman" w:cs="Times New Roman"/>
+          <w:sz w:val="24"/>
+          <w:szCs w:val="24"/>
+        </w:rPr>
+        <w:t>збитків</w:t>
+      </w:r>
+      <w:proofErr w:type="spellEnd"/>
+      <w:r>
+        <w:rPr>
+          <w:rFonts w:ascii="Times New Roman" w:hAnsi="Times New Roman" w:cs="Times New Roman"/>
+          <w:sz w:val="24"/>
+          <w:szCs w:val="24"/>
+        </w:rPr>
+        <w:t xml:space="preserve"> </w:t>
+      </w:r>
+      <w:proofErr w:type="spellStart"/>
+      <w:r>
+        <w:rPr>
+          <w:rFonts w:ascii="Times New Roman" w:hAnsi="Times New Roman" w:cs="Times New Roman"/>
+          <w:sz w:val="24"/>
+          <w:szCs w:val="24"/>
+        </w:rPr>
+        <w:t>державі</w:t>
+      </w:r>
+      <w:proofErr w:type="spellEnd"/>
+      <w:r>
+        <w:rPr>
+          <w:rFonts w:ascii="Times New Roman" w:hAnsi="Times New Roman" w:cs="Times New Roman"/>
+          <w:sz w:val="24"/>
+          <w:szCs w:val="24"/>
+        </w:rPr>
+        <w:t xml:space="preserve">, не </w:t>
+      </w:r>
+      <w:proofErr w:type="spellStart"/>
+      <w:r>
+        <w:rPr>
+          <w:rFonts w:ascii="Times New Roman" w:hAnsi="Times New Roman" w:cs="Times New Roman"/>
+          <w:sz w:val="24"/>
+          <w:szCs w:val="24"/>
+        </w:rPr>
+        <w:t>прогнозується</w:t>
+      </w:r>
+      <w:proofErr w:type="spellEnd"/>
+      <w:r>
+        <w:rPr>
+          <w:rFonts w:ascii="Times New Roman" w:hAnsi="Times New Roman" w:cs="Times New Roman"/>
+          <w:sz w:val="24"/>
+          <w:szCs w:val="24"/>
+        </w:rPr>
+        <w:t>.</w:t>
       </w:r>
     </w:p>
     <w:tbl>
       <w:tblPr>
         <w:tblStyle w:val="ac"/>
         <w:tblW w:w="0" w:type="auto"/>
+        <w:tblBorders>
+          <w:top w:val="none" w:sz="0" w:space="0" w:color="auto"/>
+          <w:left w:val="none" w:sz="0" w:space="0" w:color="auto"/>
+          <w:bottom w:val="none" w:sz="0" w:space="0" w:color="auto"/>
+          <w:right w:val="none" w:sz="0" w:space="0" w:color="auto"/>
+          <w:insideH w:val="none" w:sz="0" w:space="0" w:color="auto"/>
+          <w:insideV w:val="none" w:sz="0" w:space="0" w:color="auto"/>
+        </w:tblBorders>
+        <w:tblLayout w:type="fixed"/>
         <w:tblLook w:val="04A0" w:firstRow="1" w:lastRow="0" w:firstColumn="1" w:lastColumn="0" w:noHBand="0" w:noVBand="1"/>
       </w:tblPr>
       <w:tblGrid>
-        <w:gridCol w:w="6995"/>
-        <w:gridCol w:w="2349"/>
+        <w:gridCol w:w="6912"/>
+        <w:gridCol w:w="2658"/>
       </w:tblGrid>
       <w:tr>
+        <w:trPr>
+          <w:cantSplit/>
+          <w:trHeight w:val="300"/>
+        </w:trPr>
         <w:tc>
           <w:tcPr>
-            <w:tcW w:w="7196" w:type="dxa"/>
+            <w:tcW w:w="9570" w:type="dxa"/>
+            <w:gridSpan w:val="2"/>
           </w:tcPr>
           <w:p>
             <w:pPr>
-              <w:rPr>
-                <w:rFonts w:ascii="Times New Roman" w:hAnsi="Times New Roman" w:cs="Times New Roman"/>
-                <w:sz w:val="28"/>
-                <w:szCs w:val="28"/>
+              <w:keepNext/>
+              <w:rPr>
+                <w:rFonts w:ascii="Times New Roman" w:hAnsi="Times New Roman" w:cs="Times New Roman"/>
+                <w:sz w:val="24"/>
+                <w:szCs w:val="24"/>
                 <w:lang w:val="uk-UA"/>
               </w:rPr>
             </w:pPr>
             <w:r>
               <w:rPr>
                 <w:rFonts w:ascii="Times New Roman" w:hAnsi="Times New Roman" w:cs="Times New Roman"/>
-                <w:sz w:val="28"/>
-                <w:szCs w:val="28"/>
+                <w:sz w:val="24"/>
+                <w:szCs w:val="24"/>
                 <w:lang w:val="uk-UA"/>
               </w:rPr>
               <w:t>{</w:t>
@@ -1283,18 +1830,140 @@
             <w:r>
               <w:rPr>
                 <w:rFonts w:ascii="Times New Roman" w:hAnsi="Times New Roman" w:cs="Times New Roman"/>
-                <w:sz w:val="28"/>
-                <w:szCs w:val="28"/>
-                <w:lang w:val="uk-UA"/>
-              </w:rPr>
-              <w:t>rank</w:t>
+                <w:sz w:val="24"/>
+                <w:szCs w:val="24"/>
+                <w:lang w:val="uk-UA"/>
+              </w:rPr>
+              <w:t>legalApprovalPosition</w:t>
             </w:r>
             <w:proofErr w:type="spellEnd"/>
             <w:r>
               <w:rPr>
                 <w:rFonts w:ascii="Times New Roman" w:hAnsi="Times New Roman" w:cs="Times New Roman"/>
-                <w:sz w:val="28"/>
-                <w:szCs w:val="28"/>
+                <w:sz w:val="24"/>
+                <w:szCs w:val="24"/>
+                <w:lang w:val="uk-UA"/>
+              </w:rPr>
+              <w:t>}</w:t>
+            </w:r>
+          </w:p>
+        </w:tc>
+      </w:tr>
+      <w:tr>
+        <w:trPr>
+          <w:cantSplit/>
+          <w:trHeight w:val="300"/>
+        </w:trPr>
+        <w:tc>
+          <w:tcPr>
+            <w:tcW w:w="6912" w:type="dxa"/>
+          </w:tcPr>
+          <w:p>
+            <w:pPr>
+              <w:keepNext/>
+              <w:keepLines/>
+              <w:rPr>
+                <w:rFonts w:ascii="Times New Roman" w:hAnsi="Times New Roman" w:cs="Times New Roman"/>
+                <w:sz w:val="24"/>
+                <w:szCs w:val="24"/>
+                <w:lang w:val="uk-UA"/>
+              </w:rPr>
+            </w:pPr>
+            <w:r>
+              <w:rPr>
+                <w:rFonts w:ascii="Times New Roman" w:hAnsi="Times New Roman" w:cs="Times New Roman"/>
+                <w:sz w:val="24"/>
+                <w:szCs w:val="24"/>
+                <w:lang w:val="uk-UA"/>
+              </w:rPr>
+              <w:t>{</w:t>
+            </w:r>
+            <w:proofErr w:type="spellStart"/>
+            <w:r>
+              <w:rPr>
+                <w:rFonts w:ascii="Times New Roman" w:hAnsi="Times New Roman" w:cs="Times New Roman"/>
+                <w:sz w:val="24"/>
+                <w:szCs w:val="24"/>
+                <w:lang w:val="uk-UA"/>
+              </w:rPr>
+              <w:t>legalApprovalRank</w:t>
+            </w:r>
+            <w:proofErr w:type="spellEnd"/>
+            <w:r>
+              <w:rPr>
+                <w:rFonts w:ascii="Times New Roman" w:hAnsi="Times New Roman" w:cs="Times New Roman"/>
+                <w:sz w:val="24"/>
+                <w:szCs w:val="24"/>
+                <w:lang w:val="uk-UA"/>
+              </w:rPr>
+              <w:t>}</w:t>
+            </w:r>
+            <w:r>
+              <w:rPr>
+                <w:rFonts w:ascii="Times New Roman" w:hAnsi="Times New Roman" w:cs="Times New Roman"/>
+                <w:sz w:val="24"/>
+                <w:szCs w:val="24"/>
+                <w:lang w:val="uk-UA"/>
+              </w:rPr>
+              <w:br/>
+              <w:t>{</w:t>
+            </w:r>
+            <w:proofErr w:type="spellStart"/>
+            <w:r>
+              <w:rPr>
+                <w:rFonts w:ascii="Times New Roman" w:hAnsi="Times New Roman" w:cs="Times New Roman"/>
+                <w:sz w:val="24"/>
+                <w:szCs w:val="24"/>
+                <w:lang w:val="uk-UA"/>
+              </w:rPr>
+              <w:t>legalApprovalDay</w:t>
+            </w:r>
+            <w:proofErr w:type="spellEnd"/>
+            <w:r>
+              <w:rPr>
+                <w:rFonts w:ascii="Times New Roman" w:hAnsi="Times New Roman" w:cs="Times New Roman"/>
+                <w:sz w:val="24"/>
+                <w:szCs w:val="24"/>
+                <w:lang w:val="uk-UA"/>
+              </w:rPr>
+              <w:t>}.{</w:t>
+            </w:r>
+            <w:proofErr w:type="spellStart"/>
+            <w:r>
+              <w:rPr>
+                <w:rFonts w:ascii="Times New Roman" w:hAnsi="Times New Roman" w:cs="Times New Roman"/>
+                <w:sz w:val="24"/>
+                <w:szCs w:val="24"/>
+                <w:lang w:val="uk-UA"/>
+              </w:rPr>
+              <w:t>legalApprovalMonth</w:t>
+            </w:r>
+            <w:proofErr w:type="spellEnd"/>
+            <w:r>
+              <w:rPr>
+                <w:rFonts w:ascii="Times New Roman" w:hAnsi="Times New Roman" w:cs="Times New Roman"/>
+                <w:sz w:val="24"/>
+                <w:szCs w:val="24"/>
+                <w:lang w:val="uk-UA"/>
+              </w:rPr>
+              <w:t>}.{</w:t>
+            </w:r>
+            <w:proofErr w:type="spellStart"/>
+            <w:r>
+              <w:rPr>
+                <w:rFonts w:ascii="Times New Roman" w:hAnsi="Times New Roman" w:cs="Times New Roman"/>
+                <w:sz w:val="24"/>
+                <w:szCs w:val="24"/>
+                <w:lang w:val="uk-UA"/>
+              </w:rPr>
+              <w:t>legalApprovalYear</w:t>
+            </w:r>
+            <w:proofErr w:type="spellEnd"/>
+            <w:r>
+              <w:rPr>
+                <w:rFonts w:ascii="Times New Roman" w:hAnsi="Times New Roman" w:cs="Times New Roman"/>
+                <w:sz w:val="24"/>
+                <w:szCs w:val="24"/>
                 <w:lang w:val="uk-UA"/>
               </w:rPr>
               <w:t>}</w:t>
@@ -1303,23 +1972,26 @@
         </w:tc>
         <w:tc>
           <w:tcPr>
-            <w:tcW w:w="2374" w:type="dxa"/>
+            <w:tcW w:w="2658" w:type="dxa"/>
             <w:vAlign w:val="center"/>
           </w:tcPr>
           <w:p>
             <w:pPr>
-              <w:rPr>
-                <w:rFonts w:ascii="Times New Roman" w:hAnsi="Times New Roman" w:cs="Times New Roman"/>
-                <w:sz w:val="28"/>
-                <w:szCs w:val="28"/>
+              <w:keepNext/>
+              <w:keepLines/>
+              <w:jc w:val="right"/>
+              <w:rPr>
+                <w:rFonts w:ascii="Times New Roman" w:hAnsi="Times New Roman" w:cs="Times New Roman"/>
+                <w:sz w:val="24"/>
+                <w:szCs w:val="24"/>
                 <w:lang w:val="uk-UA"/>
               </w:rPr>
             </w:pPr>
             <w:r>
               <w:rPr>
                 <w:rFonts w:ascii="Times New Roman" w:hAnsi="Times New Roman" w:cs="Times New Roman"/>
-                <w:sz w:val="28"/>
-                <w:szCs w:val="28"/>
+                <w:sz w:val="24"/>
+                <w:szCs w:val="24"/>
                 <w:lang w:val="uk-UA"/>
               </w:rPr>
               <w:t>{</w:t>
@@ -1328,56 +2000,38 @@
             <w:r>
               <w:rPr>
                 <w:rFonts w:ascii="Times New Roman" w:hAnsi="Times New Roman" w:cs="Times New Roman"/>
-                <w:sz w:val="28"/>
-                <w:szCs w:val="28"/>
-                <w:lang w:val="uk-UA"/>
-              </w:rPr>
-              <w:t>firstName</w:t>
+                <w:sz w:val="24"/>
+                <w:szCs w:val="24"/>
+                <w:lang w:val="uk-UA"/>
+              </w:rPr>
+              <w:t>legalApprovalFirstName</w:t>
             </w:r>
             <w:proofErr w:type="spellEnd"/>
             <w:r>
               <w:rPr>
                 <w:rFonts w:ascii="Times New Roman" w:hAnsi="Times New Roman" w:cs="Times New Roman"/>
-                <w:sz w:val="28"/>
-                <w:szCs w:val="28"/>
-                <w:lang w:val="uk-UA"/>
-              </w:rPr>
-              <w:t>}</w:t>
-            </w:r>
-            <w:r>
-              <w:rPr>
-                <w:rFonts w:ascii="Times New Roman" w:hAnsi="Times New Roman" w:cs="Times New Roman"/>
-                <w:sz w:val="28"/>
-                <w:szCs w:val="28"/>
-                <w:lang w:val="uk-UA"/>
-              </w:rPr>
-              <w:t xml:space="preserve"> </w:t>
-            </w:r>
-            <w:r>
-              <w:rPr>
-                <w:rFonts w:ascii="Times New Roman" w:hAnsi="Times New Roman" w:cs="Times New Roman"/>
-                <w:sz w:val="28"/>
-                <w:szCs w:val="28"/>
-                <w:lang w:val="uk-UA"/>
-              </w:rPr>
-              <w:t>{</w:t>
+                <w:sz w:val="24"/>
+                <w:szCs w:val="24"/>
+                <w:lang w:val="uk-UA"/>
+              </w:rPr>
+              <w:t>} {</w:t>
             </w:r>
             <w:proofErr w:type="spellStart"/>
             <w:r>
               <w:rPr>
                 <w:rFonts w:ascii="Times New Roman" w:hAnsi="Times New Roman" w:cs="Times New Roman"/>
-                <w:sz w:val="28"/>
-                <w:szCs w:val="28"/>
-                <w:lang w:val="uk-UA"/>
-              </w:rPr>
-              <w:t>lastName</w:t>
+                <w:sz w:val="24"/>
+                <w:szCs w:val="24"/>
+                <w:lang w:val="uk-UA"/>
+              </w:rPr>
+              <w:t>legalApprovalLastName</w:t>
             </w:r>
             <w:proofErr w:type="spellEnd"/>
             <w:r>
               <w:rPr>
                 <w:rFonts w:ascii="Times New Roman" w:hAnsi="Times New Roman" w:cs="Times New Roman"/>
-                <w:sz w:val="28"/>
-                <w:szCs w:val="28"/>
+                <w:sz w:val="24"/>
+                <w:szCs w:val="24"/>
                 <w:lang w:val="uk-UA"/>
               </w:rPr>
               <w:t>}</w:t>
@@ -1388,596 +2042,102 @@
     </w:tbl>
     <w:p>
       <w:pPr>
-        <w:spacing w:line="240" w:lineRule="auto"/>
-        <w:rPr>
-          <w:rFonts w:ascii="Times New Roman" w:hAnsi="Times New Roman" w:cs="Times New Roman"/>
-          <w:sz w:val="28"/>
-          <w:szCs w:val="28"/>
+        <w:spacing w:after="360" w:line="240" w:lineRule="exact"/>
+        <w:rPr>
+          <w:rFonts w:ascii="Times New Roman" w:hAnsi="Times New Roman" w:cs="Times New Roman"/>
+          <w:sz w:val="24"/>
+          <w:szCs w:val="24"/>
           <w:lang w:val="uk-UA"/>
         </w:rPr>
       </w:pPr>
-      <w:r>
-        <w:rPr>
-          <w:rFonts w:ascii="Times New Roman" w:hAnsi="Times New Roman" w:cs="Times New Roman"/>
-          <w:sz w:val="28"/>
-          <w:szCs w:val="28"/>
-          <w:lang w:val="uk-UA"/>
-        </w:rPr>
-        <w:t>{</w:t>
-      </w:r>
-      <w:proofErr w:type="spellStart"/>
-      <w:r>
-        <w:rPr>
-          <w:rFonts w:ascii="Times New Roman" w:hAnsi="Times New Roman" w:cs="Times New Roman"/>
-          <w:sz w:val="28"/>
-          <w:szCs w:val="28"/>
-          <w:lang w:val="uk-UA"/>
-        </w:rPr>
-        <w:t>approvalDay</w:t>
-      </w:r>
-      <w:proofErr w:type="spellEnd"/>
-      <w:r>
-        <w:rPr>
-          <w:rFonts w:ascii="Times New Roman" w:hAnsi="Times New Roman" w:cs="Times New Roman"/>
-          <w:sz w:val="28"/>
-          <w:szCs w:val="28"/>
-          <w:lang w:val="uk-UA"/>
-        </w:rPr>
-        <w:t>}.{</w:t>
-      </w:r>
-      <w:proofErr w:type="spellStart"/>
-      <w:r>
-        <w:rPr>
-          <w:rFonts w:ascii="Times New Roman" w:hAnsi="Times New Roman" w:cs="Times New Roman"/>
-          <w:sz w:val="28"/>
-          <w:szCs w:val="28"/>
-          <w:lang w:val="uk-UA"/>
-        </w:rPr>
-        <w:t>approvalMonth</w:t>
-      </w:r>
-      <w:proofErr w:type="spellEnd"/>
-      <w:r>
-        <w:rPr>
-          <w:rFonts w:ascii="Times New Roman" w:hAnsi="Times New Roman" w:cs="Times New Roman"/>
-          <w:sz w:val="28"/>
-          <w:szCs w:val="28"/>
-          <w:lang w:val="uk-UA"/>
-        </w:rPr>
-        <w:t>}.{</w:t>
-      </w:r>
-      <w:proofErr w:type="spellStart"/>
-      <w:r>
-        <w:rPr>
-          <w:rFonts w:ascii="Times New Roman" w:hAnsi="Times New Roman" w:cs="Times New Roman"/>
-          <w:sz w:val="28"/>
-          <w:szCs w:val="28"/>
-          <w:lang w:val="uk-UA"/>
-        </w:rPr>
-        <w:t>approvalYear</w:t>
-      </w:r>
-      <w:proofErr w:type="spellEnd"/>
-      <w:r>
-        <w:rPr>
-          <w:rFonts w:ascii="Times New Roman" w:hAnsi="Times New Roman" w:cs="Times New Roman"/>
-          <w:sz w:val="28"/>
-          <w:szCs w:val="28"/>
-          <w:lang w:val="uk-UA"/>
-        </w:rPr>
-        <w:t>}</w:t>
-      </w:r>
-    </w:p>
-    <w:p>
-      <w:pPr>
-        <w:spacing w:line="240" w:lineRule="auto"/>
-        <w:rPr>
-          <w:rFonts w:ascii="Times New Roman" w:hAnsi="Times New Roman" w:cs="Times New Roman"/>
-          <w:sz w:val="28"/>
-          <w:szCs w:val="28"/>
-          <w:lang w:val="uk-UA"/>
-        </w:rPr>
-      </w:pPr>
-      <w:r>
-        <w:rPr>
-          <w:rFonts w:ascii="Times New Roman" w:hAnsi="Times New Roman" w:cs="Times New Roman"/>
-          <w:sz w:val="28"/>
-          <w:szCs w:val="28"/>
-          <w:lang w:val="uk-UA"/>
-        </w:rPr>
-        <w:t>{/</w:t>
-      </w:r>
-      <w:proofErr w:type="spellStart"/>
-      <w:r>
-        <w:rPr>
-          <w:rFonts w:ascii="Times New Roman" w:hAnsi="Times New Roman" w:cs="Times New Roman"/>
-          <w:sz w:val="28"/>
-          <w:szCs w:val="28"/>
-          <w:lang w:val="uk-UA"/>
-        </w:rPr>
-        <w:t>approvals</w:t>
-      </w:r>
-      <w:proofErr w:type="spellEnd"/>
-      <w:r>
-        <w:rPr>
-          <w:rFonts w:ascii="Times New Roman" w:hAnsi="Times New Roman" w:cs="Times New Roman"/>
-          <w:sz w:val="28"/>
-          <w:szCs w:val="28"/>
-          <w:lang w:val="uk-UA"/>
-        </w:rPr>
-        <w:t>}</w:t>
-      </w:r>
-    </w:p>
-    <w:p>
-      <w:pPr>
-        <w:tabs>
-          <w:tab w:val="left" w:pos="142"/>
-        </w:tabs>
-        <w:spacing w:after="0" w:line="240" w:lineRule="auto"/>
-        <w:jc w:val="both"/>
-        <w:rPr>
-          <w:rFonts w:ascii="Times New Roman" w:hAnsi="Times New Roman" w:cs="Times New Roman"/>
-          <w:sz w:val="24"/>
-          <w:szCs w:val="24"/>
-        </w:rPr>
-      </w:pPr>
-      <w:proofErr w:type="spellStart"/>
-      <w:r>
-        <w:rPr>
-          <w:rFonts w:ascii="Times New Roman" w:hAnsi="Times New Roman" w:cs="Times New Roman"/>
-          <w:sz w:val="24"/>
-          <w:szCs w:val="24"/>
-        </w:rPr>
-        <w:t>Зміст</w:t>
-      </w:r>
-      <w:proofErr w:type="spellEnd"/>
-      <w:r>
-        <w:rPr>
-          <w:rFonts w:ascii="Times New Roman" w:hAnsi="Times New Roman" w:cs="Times New Roman"/>
-          <w:sz w:val="24"/>
-          <w:szCs w:val="24"/>
-        </w:rPr>
-        <w:t xml:space="preserve"> документа </w:t>
-      </w:r>
-      <w:proofErr w:type="spellStart"/>
-      <w:r>
-        <w:rPr>
-          <w:rFonts w:ascii="Times New Roman" w:hAnsi="Times New Roman" w:cs="Times New Roman"/>
-          <w:sz w:val="24"/>
-          <w:szCs w:val="24"/>
-        </w:rPr>
-        <w:t>вимогам</w:t>
-      </w:r>
-      <w:proofErr w:type="spellEnd"/>
-      <w:r>
-        <w:rPr>
-          <w:rFonts w:ascii="Times New Roman" w:hAnsi="Times New Roman" w:cs="Times New Roman"/>
-          <w:sz w:val="24"/>
-          <w:szCs w:val="24"/>
-        </w:rPr>
-        <w:t xml:space="preserve"> чинного </w:t>
-      </w:r>
-      <w:proofErr w:type="spellStart"/>
-      <w:r>
-        <w:rPr>
-          <w:rFonts w:ascii="Times New Roman" w:hAnsi="Times New Roman" w:cs="Times New Roman"/>
-          <w:sz w:val="24"/>
-          <w:szCs w:val="24"/>
-        </w:rPr>
-        <w:t>законодавства</w:t>
-      </w:r>
-      <w:proofErr w:type="spellEnd"/>
-      <w:r>
-        <w:rPr>
-          <w:rFonts w:ascii="Times New Roman" w:hAnsi="Times New Roman" w:cs="Times New Roman"/>
-          <w:sz w:val="24"/>
-          <w:szCs w:val="24"/>
-        </w:rPr>
-        <w:t xml:space="preserve"> </w:t>
-      </w:r>
-      <w:proofErr w:type="spellStart"/>
-      <w:r>
-        <w:rPr>
-          <w:rFonts w:ascii="Times New Roman" w:hAnsi="Times New Roman" w:cs="Times New Roman"/>
-          <w:sz w:val="24"/>
-          <w:szCs w:val="24"/>
-        </w:rPr>
-        <w:t>відповідає</w:t>
-      </w:r>
-      <w:proofErr w:type="spellEnd"/>
-      <w:r>
-        <w:rPr>
-          <w:rFonts w:ascii="Times New Roman" w:hAnsi="Times New Roman" w:cs="Times New Roman"/>
-          <w:sz w:val="24"/>
-          <w:szCs w:val="24"/>
-        </w:rPr>
-        <w:t xml:space="preserve">. </w:t>
-      </w:r>
-      <w:proofErr w:type="spellStart"/>
-      <w:r>
-        <w:rPr>
-          <w:rFonts w:ascii="Times New Roman" w:hAnsi="Times New Roman" w:cs="Times New Roman"/>
-          <w:sz w:val="24"/>
-          <w:szCs w:val="24"/>
-        </w:rPr>
-        <w:t>Негативних</w:t>
-      </w:r>
-      <w:proofErr w:type="spellEnd"/>
-      <w:r>
-        <w:rPr>
-          <w:rFonts w:ascii="Times New Roman" w:hAnsi="Times New Roman" w:cs="Times New Roman"/>
-          <w:sz w:val="24"/>
-          <w:szCs w:val="24"/>
-        </w:rPr>
-        <w:t xml:space="preserve"> </w:t>
-      </w:r>
-      <w:proofErr w:type="spellStart"/>
-      <w:r>
-        <w:rPr>
-          <w:rFonts w:ascii="Times New Roman" w:hAnsi="Times New Roman" w:cs="Times New Roman"/>
-          <w:sz w:val="24"/>
-          <w:szCs w:val="24"/>
-        </w:rPr>
-        <w:t>правових</w:t>
-      </w:r>
-      <w:proofErr w:type="spellEnd"/>
-      <w:r>
-        <w:rPr>
-          <w:rFonts w:ascii="Times New Roman" w:hAnsi="Times New Roman" w:cs="Times New Roman"/>
-          <w:sz w:val="24"/>
-          <w:szCs w:val="24"/>
-        </w:rPr>
-        <w:t xml:space="preserve"> </w:t>
-      </w:r>
-      <w:proofErr w:type="spellStart"/>
-      <w:r>
-        <w:rPr>
-          <w:rFonts w:ascii="Times New Roman" w:hAnsi="Times New Roman" w:cs="Times New Roman"/>
-          <w:sz w:val="24"/>
-          <w:szCs w:val="24"/>
-        </w:rPr>
-        <w:t>наслідків</w:t>
-      </w:r>
-      <w:proofErr w:type="spellEnd"/>
-      <w:r>
-        <w:rPr>
-          <w:rFonts w:ascii="Times New Roman" w:hAnsi="Times New Roman" w:cs="Times New Roman"/>
-          <w:sz w:val="24"/>
-          <w:szCs w:val="24"/>
-        </w:rPr>
-        <w:t xml:space="preserve"> </w:t>
-      </w:r>
-      <w:proofErr w:type="spellStart"/>
-      <w:r>
-        <w:rPr>
-          <w:rFonts w:ascii="Times New Roman" w:hAnsi="Times New Roman" w:cs="Times New Roman"/>
-          <w:sz w:val="24"/>
-          <w:szCs w:val="24"/>
-        </w:rPr>
-        <w:t>реалізації</w:t>
-      </w:r>
-      <w:proofErr w:type="spellEnd"/>
-      <w:r>
-        <w:rPr>
-          <w:rFonts w:ascii="Times New Roman" w:hAnsi="Times New Roman" w:cs="Times New Roman"/>
-          <w:sz w:val="24"/>
-          <w:szCs w:val="24"/>
-        </w:rPr>
-        <w:t xml:space="preserve"> </w:t>
-      </w:r>
-      <w:proofErr w:type="spellStart"/>
-      <w:r>
-        <w:rPr>
-          <w:rFonts w:ascii="Times New Roman" w:hAnsi="Times New Roman" w:cs="Times New Roman"/>
-          <w:sz w:val="24"/>
-          <w:szCs w:val="24"/>
-        </w:rPr>
-        <w:t>положень</w:t>
-      </w:r>
-      <w:proofErr w:type="spellEnd"/>
-      <w:r>
-        <w:rPr>
-          <w:rFonts w:ascii="Times New Roman" w:hAnsi="Times New Roman" w:cs="Times New Roman"/>
-          <w:sz w:val="24"/>
-          <w:szCs w:val="24"/>
-        </w:rPr>
-        <w:t xml:space="preserve"> документа, у тому </w:t>
-      </w:r>
-      <w:proofErr w:type="spellStart"/>
-      <w:r>
-        <w:rPr>
-          <w:rFonts w:ascii="Times New Roman" w:hAnsi="Times New Roman" w:cs="Times New Roman"/>
-          <w:sz w:val="24"/>
-          <w:szCs w:val="24"/>
-        </w:rPr>
-        <w:t>числі</w:t>
-      </w:r>
-      <w:proofErr w:type="spellEnd"/>
-      <w:r>
-        <w:rPr>
-          <w:rFonts w:ascii="Times New Roman" w:hAnsi="Times New Roman" w:cs="Times New Roman"/>
-          <w:sz w:val="24"/>
-          <w:szCs w:val="24"/>
-        </w:rPr>
-        <w:t xml:space="preserve"> </w:t>
-      </w:r>
-      <w:proofErr w:type="spellStart"/>
-      <w:r>
-        <w:rPr>
-          <w:rFonts w:ascii="Times New Roman" w:hAnsi="Times New Roman" w:cs="Times New Roman"/>
-          <w:sz w:val="24"/>
-          <w:szCs w:val="24"/>
-        </w:rPr>
-        <w:t>порушень</w:t>
-      </w:r>
-      <w:proofErr w:type="spellEnd"/>
-      <w:r>
-        <w:rPr>
-          <w:rFonts w:ascii="Times New Roman" w:hAnsi="Times New Roman" w:cs="Times New Roman"/>
-          <w:sz w:val="24"/>
-          <w:szCs w:val="24"/>
-        </w:rPr>
-        <w:t xml:space="preserve"> </w:t>
-      </w:r>
-      <w:proofErr w:type="spellStart"/>
-      <w:r>
-        <w:rPr>
-          <w:rFonts w:ascii="Times New Roman" w:hAnsi="Times New Roman" w:cs="Times New Roman"/>
-          <w:sz w:val="24"/>
-          <w:szCs w:val="24"/>
-        </w:rPr>
-        <w:t>законодавства</w:t>
-      </w:r>
-      <w:proofErr w:type="spellEnd"/>
-      <w:r>
-        <w:rPr>
-          <w:rFonts w:ascii="Times New Roman" w:hAnsi="Times New Roman" w:cs="Times New Roman"/>
-          <w:sz w:val="24"/>
-          <w:szCs w:val="24"/>
-        </w:rPr>
-        <w:t xml:space="preserve">, </w:t>
-      </w:r>
-      <w:proofErr w:type="spellStart"/>
-      <w:r>
-        <w:rPr>
-          <w:rFonts w:ascii="Times New Roman" w:hAnsi="Times New Roman" w:cs="Times New Roman"/>
-          <w:sz w:val="24"/>
-          <w:szCs w:val="24"/>
-        </w:rPr>
-        <w:t>що</w:t>
-      </w:r>
-      <w:proofErr w:type="spellEnd"/>
-      <w:r>
-        <w:rPr>
-          <w:rFonts w:ascii="Times New Roman" w:hAnsi="Times New Roman" w:cs="Times New Roman"/>
-          <w:sz w:val="24"/>
-          <w:szCs w:val="24"/>
-        </w:rPr>
-        <w:t xml:space="preserve"> </w:t>
-      </w:r>
-      <w:proofErr w:type="spellStart"/>
-      <w:r>
-        <w:rPr>
-          <w:rFonts w:ascii="Times New Roman" w:hAnsi="Times New Roman" w:cs="Times New Roman"/>
-          <w:sz w:val="24"/>
-          <w:szCs w:val="24"/>
-        </w:rPr>
-        <w:t>можуть</w:t>
-      </w:r>
-      <w:proofErr w:type="spellEnd"/>
-      <w:r>
-        <w:rPr>
-          <w:rFonts w:ascii="Times New Roman" w:hAnsi="Times New Roman" w:cs="Times New Roman"/>
-          <w:sz w:val="24"/>
-          <w:szCs w:val="24"/>
-        </w:rPr>
-        <w:t xml:space="preserve"> </w:t>
-      </w:r>
-      <w:proofErr w:type="spellStart"/>
-      <w:r>
-        <w:rPr>
-          <w:rFonts w:ascii="Times New Roman" w:hAnsi="Times New Roman" w:cs="Times New Roman"/>
-          <w:sz w:val="24"/>
-          <w:szCs w:val="24"/>
-        </w:rPr>
-        <w:t>створити</w:t>
-      </w:r>
-      <w:proofErr w:type="spellEnd"/>
-      <w:r>
-        <w:rPr>
-          <w:rFonts w:ascii="Times New Roman" w:hAnsi="Times New Roman" w:cs="Times New Roman"/>
-          <w:sz w:val="24"/>
-          <w:szCs w:val="24"/>
-        </w:rPr>
-        <w:t xml:space="preserve"> </w:t>
-      </w:r>
-      <w:proofErr w:type="spellStart"/>
-      <w:r>
-        <w:rPr>
-          <w:rFonts w:ascii="Times New Roman" w:hAnsi="Times New Roman" w:cs="Times New Roman"/>
-          <w:sz w:val="24"/>
-          <w:szCs w:val="24"/>
-        </w:rPr>
-        <w:t>передумови</w:t>
-      </w:r>
-      <w:proofErr w:type="spellEnd"/>
-      <w:r>
-        <w:rPr>
-          <w:rFonts w:ascii="Times New Roman" w:hAnsi="Times New Roman" w:cs="Times New Roman"/>
-          <w:sz w:val="24"/>
-          <w:szCs w:val="24"/>
-        </w:rPr>
-        <w:t xml:space="preserve"> для </w:t>
-      </w:r>
-      <w:proofErr w:type="spellStart"/>
-      <w:r>
-        <w:rPr>
-          <w:rFonts w:ascii="Times New Roman" w:hAnsi="Times New Roman" w:cs="Times New Roman"/>
-          <w:sz w:val="24"/>
-          <w:szCs w:val="24"/>
-        </w:rPr>
-        <w:t>нанесення</w:t>
-      </w:r>
-      <w:proofErr w:type="spellEnd"/>
-      <w:r>
-        <w:rPr>
-          <w:rFonts w:ascii="Times New Roman" w:hAnsi="Times New Roman" w:cs="Times New Roman"/>
-          <w:sz w:val="24"/>
-          <w:szCs w:val="24"/>
-        </w:rPr>
-        <w:t xml:space="preserve"> </w:t>
-      </w:r>
-      <w:proofErr w:type="spellStart"/>
-      <w:r>
-        <w:rPr>
-          <w:rFonts w:ascii="Times New Roman" w:hAnsi="Times New Roman" w:cs="Times New Roman"/>
-          <w:sz w:val="24"/>
-          <w:szCs w:val="24"/>
-        </w:rPr>
-        <w:t>економічних</w:t>
-      </w:r>
-      <w:proofErr w:type="spellEnd"/>
-      <w:r>
-        <w:rPr>
-          <w:rFonts w:ascii="Times New Roman" w:hAnsi="Times New Roman" w:cs="Times New Roman"/>
-          <w:sz w:val="24"/>
-          <w:szCs w:val="24"/>
-        </w:rPr>
-        <w:t xml:space="preserve"> </w:t>
-      </w:r>
-      <w:proofErr w:type="spellStart"/>
-      <w:r>
-        <w:rPr>
-          <w:rFonts w:ascii="Times New Roman" w:hAnsi="Times New Roman" w:cs="Times New Roman"/>
-          <w:sz w:val="24"/>
-          <w:szCs w:val="24"/>
-        </w:rPr>
-        <w:t>збитків</w:t>
-      </w:r>
-      <w:proofErr w:type="spellEnd"/>
-      <w:r>
-        <w:rPr>
-          <w:rFonts w:ascii="Times New Roman" w:hAnsi="Times New Roman" w:cs="Times New Roman"/>
-          <w:sz w:val="24"/>
-          <w:szCs w:val="24"/>
-        </w:rPr>
-        <w:t xml:space="preserve"> </w:t>
-      </w:r>
-      <w:proofErr w:type="spellStart"/>
-      <w:r>
-        <w:rPr>
-          <w:rFonts w:ascii="Times New Roman" w:hAnsi="Times New Roman" w:cs="Times New Roman"/>
-          <w:sz w:val="24"/>
-          <w:szCs w:val="24"/>
-        </w:rPr>
-        <w:t>державі</w:t>
-      </w:r>
-      <w:proofErr w:type="spellEnd"/>
-      <w:r>
-        <w:rPr>
-          <w:rFonts w:ascii="Times New Roman" w:hAnsi="Times New Roman" w:cs="Times New Roman"/>
-          <w:sz w:val="24"/>
-          <w:szCs w:val="24"/>
-        </w:rPr>
-        <w:t xml:space="preserve">, не </w:t>
-      </w:r>
-      <w:proofErr w:type="spellStart"/>
-      <w:r>
-        <w:rPr>
-          <w:rFonts w:ascii="Times New Roman" w:hAnsi="Times New Roman" w:cs="Times New Roman"/>
-          <w:sz w:val="24"/>
-          <w:szCs w:val="24"/>
-        </w:rPr>
-        <w:t>прогнозується</w:t>
-      </w:r>
-      <w:proofErr w:type="spellEnd"/>
-      <w:r>
-        <w:rPr>
-          <w:rFonts w:ascii="Times New Roman" w:hAnsi="Times New Roman" w:cs="Times New Roman"/>
-          <w:sz w:val="24"/>
-          <w:szCs w:val="24"/>
-        </w:rPr>
-        <w:t>.</w:t>
-      </w:r>
-    </w:p>
-    <w:p>
-      <w:pPr>
-        <w:spacing w:line="240" w:lineRule="auto"/>
-        <w:rPr>
-          <w:rFonts w:ascii="Times New Roman" w:hAnsi="Times New Roman" w:cs="Times New Roman"/>
-          <w:sz w:val="28"/>
-          <w:szCs w:val="28"/>
-          <w:lang w:val="uk-UA"/>
-        </w:rPr>
-      </w:pPr>
-    </w:p>
-    <w:p>
-      <w:pPr>
-        <w:spacing w:line="240" w:lineRule="auto"/>
-        <w:rPr>
-          <w:rFonts w:ascii="Times New Roman" w:hAnsi="Times New Roman" w:cs="Times New Roman"/>
-          <w:sz w:val="28"/>
-          <w:szCs w:val="28"/>
-          <w:lang w:val="uk-UA"/>
-        </w:rPr>
-      </w:pPr>
-      <w:r>
-        <w:rPr>
-          <w:rFonts w:ascii="Times New Roman" w:hAnsi="Times New Roman" w:cs="Times New Roman"/>
-          <w:sz w:val="28"/>
-          <w:szCs w:val="28"/>
-          <w:lang w:val="uk-UA"/>
-        </w:rPr>
-        <w:t>{</w:t>
-      </w:r>
-      <w:proofErr w:type="spellStart"/>
-      <w:r>
-        <w:rPr>
-          <w:rFonts w:ascii="Times New Roman" w:hAnsi="Times New Roman" w:cs="Times New Roman"/>
-          <w:sz w:val="28"/>
-          <w:szCs w:val="28"/>
-          <w:lang w:val="uk-UA"/>
-        </w:rPr>
-        <w:t>legalApprovalPosition</w:t>
-      </w:r>
-      <w:proofErr w:type="spellEnd"/>
-      <w:r>
-        <w:rPr>
-          <w:rFonts w:ascii="Times New Roman" w:hAnsi="Times New Roman" w:cs="Times New Roman"/>
-          <w:sz w:val="28"/>
-          <w:szCs w:val="28"/>
-          <w:lang w:val="uk-UA"/>
-        </w:rPr>
-        <w:t>}</w:t>
-      </w:r>
     </w:p>
     <w:tbl>
       <w:tblPr>
         <w:tblStyle w:val="ac"/>
         <w:tblW w:w="0" w:type="auto"/>
+        <w:tblBorders>
+          <w:top w:val="none" w:sz="0" w:space="0" w:color="auto"/>
+          <w:left w:val="none" w:sz="0" w:space="0" w:color="auto"/>
+          <w:bottom w:val="none" w:sz="0" w:space="0" w:color="auto"/>
+          <w:right w:val="none" w:sz="0" w:space="0" w:color="auto"/>
+          <w:insideH w:val="none" w:sz="0" w:space="0" w:color="auto"/>
+          <w:insideV w:val="none" w:sz="0" w:space="0" w:color="auto"/>
+        </w:tblBorders>
+        <w:tblLayout w:type="fixed"/>
         <w:tblLook w:val="04A0" w:firstRow="1" w:lastRow="0" w:firstColumn="1" w:lastColumn="0" w:noHBand="0" w:noVBand="1"/>
       </w:tblPr>
       <w:tblGrid>
-        <w:gridCol w:w="6075"/>
-        <w:gridCol w:w="3269"/>
+        <w:gridCol w:w="6912"/>
+        <w:gridCol w:w="2658"/>
       </w:tblGrid>
       <w:tr>
+        <w:trPr>
+          <w:trHeight w:val="300"/>
+        </w:trPr>
         <w:tc>
           <w:tcPr>
-            <w:tcW w:w="7196" w:type="dxa"/>
+            <w:tcW w:w="9570" w:type="dxa"/>
+            <w:gridSpan w:val="2"/>
           </w:tcPr>
           <w:p>
             <w:pPr>
-              <w:rPr>
-                <w:rFonts w:ascii="Times New Roman" w:hAnsi="Times New Roman" w:cs="Times New Roman"/>
-                <w:sz w:val="28"/>
-                <w:szCs w:val="28"/>
+              <w:keepNext/>
+              <w:keepLines/>
+              <w:rPr>
+                <w:rFonts w:ascii="Times New Roman" w:hAnsi="Times New Roman" w:cs="Times New Roman"/>
+                <w:sz w:val="24"/>
+                <w:szCs w:val="24"/>
                 <w:lang w:val="uk-UA"/>
               </w:rPr>
             </w:pPr>
-            <w:r>
-              <w:rPr>
-                <w:rFonts w:ascii="Times New Roman" w:hAnsi="Times New Roman" w:cs="Times New Roman"/>
-                <w:sz w:val="28"/>
-                <w:szCs w:val="28"/>
+            <w:proofErr w:type="spellStart"/>
+            <w:r>
+              <w:rPr>
+                <w:rFonts w:ascii="Times New Roman" w:hAnsi="Times New Roman" w:cs="Times New Roman"/>
+                <w:sz w:val="24"/>
+                <w:szCs w:val="24"/>
+                <w:lang w:val="uk-UA"/>
+              </w:rPr>
+              <w:t>Проект</w:t>
+            </w:r>
+            <w:proofErr w:type="spellEnd"/>
+            <w:r>
+              <w:rPr>
+                <w:rFonts w:ascii="Times New Roman" w:hAnsi="Times New Roman" w:cs="Times New Roman"/>
+                <w:sz w:val="24"/>
+                <w:szCs w:val="24"/>
+                <w:lang w:val="uk-UA"/>
+              </w:rPr>
+              <w:t xml:space="preserve"> наказу підготував:</w:t>
+            </w:r>
+          </w:p>
+        </w:tc>
+      </w:tr>
+      <w:tr>
+        <w:trPr>
+          <w:trHeight w:val="300"/>
+        </w:trPr>
+        <w:tc>
+          <w:tcPr>
+            <w:tcW w:w="9570" w:type="dxa"/>
+            <w:gridSpan w:val="2"/>
+          </w:tcPr>
+          <w:p>
+            <w:pPr>
+              <w:keepNext/>
+              <w:keepLines/>
+              <w:rPr>
+                <w:rFonts w:ascii="Times New Roman" w:hAnsi="Times New Roman" w:cs="Times New Roman"/>
+                <w:sz w:val="24"/>
+                <w:szCs w:val="24"/>
+                <w:lang w:val="uk-UA"/>
+              </w:rPr>
+            </w:pPr>
+            <w:r>
+              <w:rPr>
+                <w:rFonts w:ascii="Times New Roman" w:hAnsi="Times New Roman" w:cs="Times New Roman"/>
+                <w:sz w:val="24"/>
+                <w:szCs w:val="24"/>
                 <w:lang w:val="uk-UA"/>
               </w:rPr>
               <w:t>{</w:t>
@@ -1986,43 +2146,104 @@
             <w:r>
               <w:rPr>
                 <w:rFonts w:ascii="Times New Roman" w:hAnsi="Times New Roman" w:cs="Times New Roman"/>
-                <w:sz w:val="28"/>
-                <w:szCs w:val="28"/>
-                <w:lang w:val="uk-UA"/>
-              </w:rPr>
-              <w:t>legalApprovalRank</w:t>
+                <w:sz w:val="24"/>
+                <w:szCs w:val="24"/>
+                <w:lang w:val="uk-UA"/>
+              </w:rPr>
+              <w:t>orderPreparedByPosition</w:t>
             </w:r>
             <w:proofErr w:type="spellEnd"/>
             <w:r>
               <w:rPr>
                 <w:rFonts w:ascii="Times New Roman" w:hAnsi="Times New Roman" w:cs="Times New Roman"/>
-                <w:sz w:val="28"/>
-                <w:szCs w:val="28"/>
+                <w:sz w:val="24"/>
+                <w:szCs w:val="24"/>
                 <w:lang w:val="uk-UA"/>
               </w:rPr>
               <w:t>}</w:t>
+            </w:r>
+          </w:p>
+        </w:tc>
+      </w:tr>
+      <w:tr>
+        <w:trPr>
+          <w:trHeight w:val="300"/>
+        </w:trPr>
+        <w:tc>
+          <w:tcPr>
+            <w:tcW w:w="6912" w:type="dxa"/>
+          </w:tcPr>
+          <w:p>
+            <w:pPr>
+              <w:keepLines/>
+              <w:rPr>
+                <w:rFonts w:ascii="Times New Roman" w:hAnsi="Times New Roman" w:cs="Times New Roman"/>
+                <w:sz w:val="24"/>
+                <w:szCs w:val="24"/>
+                <w:lang w:val="uk-UA"/>
+              </w:rPr>
+            </w:pPr>
+            <w:r>
+              <w:rPr>
+                <w:rFonts w:ascii="Times New Roman" w:hAnsi="Times New Roman" w:cs="Times New Roman"/>
+                <w:sz w:val="24"/>
+                <w:szCs w:val="24"/>
+                <w:lang w:val="uk-UA"/>
+              </w:rPr>
+              <w:t>{</w:t>
+            </w:r>
+            <w:proofErr w:type="spellStart"/>
+            <w:r>
+              <w:rPr>
+                <w:rFonts w:ascii="Times New Roman" w:hAnsi="Times New Roman" w:cs="Times New Roman"/>
+                <w:sz w:val="24"/>
+                <w:szCs w:val="24"/>
+                <w:lang w:val="uk-UA"/>
+              </w:rPr>
+              <w:t>orderPreparedByRank</w:t>
+            </w:r>
+            <w:proofErr w:type="spellEnd"/>
+            <w:r>
+              <w:rPr>
+                <w:rFonts w:ascii="Times New Roman" w:hAnsi="Times New Roman" w:cs="Times New Roman"/>
+                <w:sz w:val="24"/>
+                <w:szCs w:val="24"/>
+                <w:lang w:val="uk-UA"/>
+              </w:rPr>
+              <w:t>}</w:t>
+            </w:r>
+            <w:r>
+              <w:rPr>
+                <w:rFonts w:ascii="Times New Roman" w:hAnsi="Times New Roman" w:cs="Times New Roman"/>
+                <w:sz w:val="24"/>
+                <w:szCs w:val="24"/>
+                <w:lang w:val="uk-UA"/>
+              </w:rPr>
+              <w:br/>
+              <w:t>{orderPreparedByDay}.{orderPreparedByMonth}.{orderPreparedByYear}</w:t>
             </w:r>
           </w:p>
         </w:tc>
         <w:tc>
           <w:tcPr>
-            <w:tcW w:w="2374" w:type="dxa"/>
-            <w:vAlign w:val="center"/>
+            <w:tcW w:w="2658" w:type="dxa"/>
           </w:tcPr>
           <w:p>
             <w:pPr>
-              <w:rPr>
-                <w:rFonts w:ascii="Times New Roman" w:hAnsi="Times New Roman" w:cs="Times New Roman"/>
-                <w:sz w:val="28"/>
-                <w:szCs w:val="28"/>
+              <w:keepLines/>
+              <w:jc w:val="right"/>
+              <w:rPr>
+                <w:rFonts w:ascii="Times New Roman" w:hAnsi="Times New Roman" w:cs="Times New Roman"/>
+                <w:sz w:val="24"/>
+                <w:szCs w:val="24"/>
                 <w:lang w:val="uk-UA"/>
               </w:rPr>
             </w:pPr>
             <w:r>
               <w:rPr>
                 <w:rFonts w:ascii="Times New Roman" w:hAnsi="Times New Roman" w:cs="Times New Roman"/>
-                <w:sz w:val="28"/>
-                <w:szCs w:val="28"/>
+                <w:sz w:val="24"/>
+                <w:szCs w:val="24"/>
                 <w:lang w:val="uk-UA"/>
               </w:rPr>
               <w:t>{</w:t>
@@ -2031,56 +2252,38 @@
             <w:r>
               <w:rPr>
                 <w:rFonts w:ascii="Times New Roman" w:hAnsi="Times New Roman" w:cs="Times New Roman"/>
-                <w:sz w:val="28"/>
-                <w:szCs w:val="28"/>
-                <w:lang w:val="uk-UA"/>
-              </w:rPr>
-              <w:t>legalApprovalFirstName</w:t>
+                <w:sz w:val="24"/>
+                <w:szCs w:val="24"/>
+                <w:lang w:val="uk-UA"/>
+              </w:rPr>
+              <w:t>orderPreparedByFirstName</w:t>
             </w:r>
             <w:proofErr w:type="spellEnd"/>
             <w:r>
               <w:rPr>
                 <w:rFonts w:ascii="Times New Roman" w:hAnsi="Times New Roman" w:cs="Times New Roman"/>
-                <w:sz w:val="28"/>
-                <w:szCs w:val="28"/>
-                <w:lang w:val="uk-UA"/>
-              </w:rPr>
-              <w:t>}</w:t>
-            </w:r>
-            <w:r>
-              <w:rPr>
-                <w:rFonts w:ascii="Times New Roman" w:hAnsi="Times New Roman" w:cs="Times New Roman"/>
-                <w:sz w:val="28"/>
-                <w:szCs w:val="28"/>
-                <w:lang w:val="uk-UA"/>
-              </w:rPr>
-              <w:t xml:space="preserve"> </w:t>
-            </w:r>
-            <w:r>
-              <w:rPr>
-                <w:rFonts w:ascii="Times New Roman" w:hAnsi="Times New Roman" w:cs="Times New Roman"/>
-                <w:sz w:val="28"/>
-                <w:szCs w:val="28"/>
-                <w:lang w:val="uk-UA"/>
-              </w:rPr>
-              <w:t>{</w:t>
+                <w:sz w:val="24"/>
+                <w:szCs w:val="24"/>
+                <w:lang w:val="uk-UA"/>
+              </w:rPr>
+              <w:t>} {</w:t>
             </w:r>
             <w:proofErr w:type="spellStart"/>
             <w:r>
               <w:rPr>
                 <w:rFonts w:ascii="Times New Roman" w:hAnsi="Times New Roman" w:cs="Times New Roman"/>
-                <w:sz w:val="28"/>
-                <w:szCs w:val="28"/>
-                <w:lang w:val="uk-UA"/>
-              </w:rPr>
-              <w:t>legalApprovalLastName</w:t>
+                <w:sz w:val="24"/>
+                <w:szCs w:val="24"/>
+                <w:lang w:val="uk-UA"/>
+              </w:rPr>
+              <w:t>orderPreparedByLastName</w:t>
             </w:r>
             <w:proofErr w:type="spellEnd"/>
             <w:r>
               <w:rPr>
                 <w:rFonts w:ascii="Times New Roman" w:hAnsi="Times New Roman" w:cs="Times New Roman"/>
-                <w:sz w:val="28"/>
-                <w:szCs w:val="28"/>
+                <w:sz w:val="24"/>
+                <w:szCs w:val="24"/>
                 <w:lang w:val="uk-UA"/>
               </w:rPr>
               <w:t>}</w:t>
@@ -2091,7 +2294,7 @@
     </w:tbl>
     <w:p>
       <w:pPr>
-        <w:spacing w:line="240" w:lineRule="auto"/>
+        <w:spacing w:after="0" w:line="20" w:lineRule="exact"/>
         <w:rPr>
           <w:rFonts w:ascii="Times New Roman" w:hAnsi="Times New Roman" w:cs="Times New Roman"/>
           <w:sz w:val="28"/>
@@ -2099,387 +2302,6 @@
           <w:lang w:val="uk-UA"/>
         </w:rPr>
       </w:pPr>
-      <w:r>
-        <w:rPr>
-          <w:rFonts w:ascii="Times New Roman" w:hAnsi="Times New Roman" w:cs="Times New Roman"/>
-          <w:sz w:val="28"/>
-          <w:szCs w:val="28"/>
-          <w:lang w:val="uk-UA"/>
-        </w:rPr>
-        <w:t>{</w:t>
-      </w:r>
-      <w:proofErr w:type="spellStart"/>
-      <w:r>
-        <w:rPr>
-          <w:rFonts w:ascii="Times New Roman" w:hAnsi="Times New Roman" w:cs="Times New Roman"/>
-          <w:sz w:val="28"/>
-          <w:szCs w:val="28"/>
-          <w:lang w:val="uk-UA"/>
-        </w:rPr>
-        <w:t>legalApprovalDay</w:t>
-      </w:r>
-      <w:proofErr w:type="spellEnd"/>
-      <w:r>
-        <w:rPr>
-          <w:rFonts w:ascii="Times New Roman" w:hAnsi="Times New Roman" w:cs="Times New Roman"/>
-          <w:sz w:val="28"/>
-          <w:szCs w:val="28"/>
-          <w:lang w:val="uk-UA"/>
-        </w:rPr>
-        <w:t>}{</w:t>
-      </w:r>
-      <w:proofErr w:type="spellStart"/>
-      <w:r>
-        <w:rPr>
-          <w:rFonts w:ascii="Times New Roman" w:hAnsi="Times New Roman" w:cs="Times New Roman"/>
-          <w:sz w:val="28"/>
-          <w:szCs w:val="28"/>
-          <w:lang w:val="uk-UA"/>
-        </w:rPr>
-        <w:t>legalApprovalMonth</w:t>
-      </w:r>
-      <w:proofErr w:type="spellEnd"/>
-      <w:r>
-        <w:rPr>
-          <w:rFonts w:ascii="Times New Roman" w:hAnsi="Times New Roman" w:cs="Times New Roman"/>
-          <w:sz w:val="28"/>
-          <w:szCs w:val="28"/>
-          <w:lang w:val="uk-UA"/>
-        </w:rPr>
-        <w:t>}{</w:t>
-      </w:r>
-      <w:proofErr w:type="spellStart"/>
-      <w:r>
-        <w:rPr>
-          <w:rFonts w:ascii="Times New Roman" w:hAnsi="Times New Roman" w:cs="Times New Roman"/>
-          <w:sz w:val="28"/>
-          <w:szCs w:val="28"/>
-          <w:lang w:val="uk-UA"/>
-        </w:rPr>
-        <w:t>legalApprovalYear</w:t>
-      </w:r>
-      <w:proofErr w:type="spellEnd"/>
-      <w:r>
-        <w:rPr>
-          <w:rFonts w:ascii="Times New Roman" w:hAnsi="Times New Roman" w:cs="Times New Roman"/>
-          <w:sz w:val="28"/>
-          <w:szCs w:val="28"/>
-          <w:lang w:val="uk-UA"/>
-        </w:rPr>
-        <w:t>}</w:t>
-      </w:r>
-    </w:p>
-    <w:p>
-      <w:pPr>
-        <w:spacing w:line="240" w:lineRule="auto"/>
-        <w:rPr>
-          <w:rFonts w:ascii="Times New Roman" w:hAnsi="Times New Roman" w:cs="Times New Roman"/>
-          <w:sz w:val="28"/>
-          <w:szCs w:val="28"/>
-          <w:lang w:val="uk-UA"/>
-        </w:rPr>
-      </w:pPr>
-    </w:p>
-    <w:p>
-      <w:pPr>
-        <w:tabs>
-          <w:tab w:val="left" w:pos="142"/>
-        </w:tabs>
-        <w:spacing w:after="0" w:line="240" w:lineRule="auto"/>
-        <w:jc w:val="both"/>
-        <w:rPr>
-          <w:rFonts w:ascii="Times New Roman" w:hAnsi="Times New Roman" w:cs="Times New Roman"/>
-          <w:sz w:val="28"/>
-          <w:szCs w:val="28"/>
-          <w:lang w:val="uk-UA"/>
-        </w:rPr>
-      </w:pPr>
-      <w:r>
-        <w:rPr>
-          <w:rFonts w:ascii="Times New Roman" w:hAnsi="Times New Roman" w:cs="Times New Roman"/>
-          <w:sz w:val="28"/>
-          <w:szCs w:val="28"/>
-        </w:rPr>
-        <w:t xml:space="preserve">Проект наказу </w:t>
-      </w:r>
-      <w:proofErr w:type="spellStart"/>
-      <w:r>
-        <w:rPr>
-          <w:rFonts w:ascii="Times New Roman" w:hAnsi="Times New Roman" w:cs="Times New Roman"/>
-          <w:sz w:val="28"/>
-          <w:szCs w:val="28"/>
-        </w:rPr>
-        <w:t>підготував</w:t>
-      </w:r>
-      <w:proofErr w:type="spellEnd"/>
-      <w:r>
-        <w:rPr>
-          <w:rFonts w:ascii="Times New Roman" w:hAnsi="Times New Roman" w:cs="Times New Roman"/>
-          <w:sz w:val="28"/>
-          <w:szCs w:val="28"/>
-        </w:rPr>
-        <w:t>:</w:t>
-      </w:r>
-    </w:p>
-    <w:p>
-      <w:pPr>
-        <w:spacing w:line="240" w:lineRule="auto"/>
-        <w:rPr>
-          <w:rFonts w:ascii="Times New Roman" w:hAnsi="Times New Roman" w:cs="Times New Roman"/>
-          <w:sz w:val="28"/>
-          <w:szCs w:val="28"/>
-          <w:lang w:val="uk-UA"/>
-        </w:rPr>
-      </w:pPr>
-      <w:r>
-        <w:rPr>
-          <w:rFonts w:ascii="Times New Roman" w:hAnsi="Times New Roman" w:cs="Times New Roman"/>
-          <w:sz w:val="28"/>
-          <w:szCs w:val="28"/>
-          <w:lang w:val="uk-UA"/>
-        </w:rPr>
-        <w:t>{</w:t>
-      </w:r>
-      <w:proofErr w:type="spellStart"/>
-      <w:r>
-        <w:rPr>
-          <w:rFonts w:ascii="Times New Roman" w:hAnsi="Times New Roman" w:cs="Times New Roman"/>
-          <w:sz w:val="28"/>
-          <w:szCs w:val="28"/>
-          <w:lang w:val="uk-UA"/>
-        </w:rPr>
-        <w:t>orderPreparedByPosition</w:t>
-      </w:r>
-      <w:proofErr w:type="spellEnd"/>
-      <w:r>
-        <w:rPr>
-          <w:rFonts w:ascii="Times New Roman" w:hAnsi="Times New Roman" w:cs="Times New Roman"/>
-          <w:sz w:val="28"/>
-          <w:szCs w:val="28"/>
-          <w:lang w:val="uk-UA"/>
-        </w:rPr>
-        <w:t>}</w:t>
-      </w:r>
-    </w:p>
-    <w:tbl>
-      <w:tblPr>
-        <w:tblStyle w:val="ac"/>
-        <w:tblW w:w="0" w:type="auto"/>
-        <w:tblLook w:val="04A0" w:firstRow="1" w:lastRow="0" w:firstColumn="1" w:lastColumn="0" w:noHBand="0" w:noVBand="1"/>
-      </w:tblPr>
-      <w:tblGrid>
-        <w:gridCol w:w="5764"/>
-        <w:gridCol w:w="3580"/>
-      </w:tblGrid>
-      <w:tr>
-        <w:tc>
-          <w:tcPr>
-            <w:tcW w:w="7196" w:type="dxa"/>
-          </w:tcPr>
-          <w:p>
-            <w:pPr>
-              <w:rPr>
-                <w:rFonts w:ascii="Times New Roman" w:hAnsi="Times New Roman" w:cs="Times New Roman"/>
-                <w:sz w:val="28"/>
-                <w:szCs w:val="28"/>
-                <w:lang w:val="uk-UA"/>
-              </w:rPr>
-            </w:pPr>
-            <w:r>
-              <w:rPr>
-                <w:rFonts w:ascii="Times New Roman" w:hAnsi="Times New Roman" w:cs="Times New Roman"/>
-                <w:sz w:val="28"/>
-                <w:szCs w:val="28"/>
-                <w:lang w:val="uk-UA"/>
-              </w:rPr>
-              <w:t>{</w:t>
-            </w:r>
-            <w:proofErr w:type="spellStart"/>
-            <w:r>
-              <w:rPr>
-                <w:rFonts w:ascii="Times New Roman" w:hAnsi="Times New Roman" w:cs="Times New Roman"/>
-                <w:sz w:val="28"/>
-                <w:szCs w:val="28"/>
-                <w:lang w:val="uk-UA"/>
-              </w:rPr>
-              <w:t>orderPreparedByRank</w:t>
-            </w:r>
-            <w:proofErr w:type="spellEnd"/>
-            <w:r>
-              <w:rPr>
-                <w:rFonts w:ascii="Times New Roman" w:hAnsi="Times New Roman" w:cs="Times New Roman"/>
-                <w:sz w:val="28"/>
-                <w:szCs w:val="28"/>
-                <w:lang w:val="uk-UA"/>
-              </w:rPr>
-              <w:t>}</w:t>
-            </w:r>
-          </w:p>
-        </w:tc>
-        <w:tc>
-          <w:tcPr>
-            <w:tcW w:w="2374" w:type="dxa"/>
-            <w:vAlign w:val="center"/>
-          </w:tcPr>
-          <w:p>
-            <w:pPr>
-              <w:rPr>
-                <w:rFonts w:ascii="Times New Roman" w:hAnsi="Times New Roman" w:cs="Times New Roman"/>
-                <w:sz w:val="28"/>
-                <w:szCs w:val="28"/>
-                <w:lang w:val="uk-UA"/>
-              </w:rPr>
-            </w:pPr>
-            <w:r>
-              <w:rPr>
-                <w:rFonts w:ascii="Times New Roman" w:hAnsi="Times New Roman" w:cs="Times New Roman"/>
-                <w:sz w:val="28"/>
-                <w:szCs w:val="28"/>
-                <w:lang w:val="uk-UA"/>
-              </w:rPr>
-              <w:t>{</w:t>
-            </w:r>
-            <w:proofErr w:type="spellStart"/>
-            <w:r>
-              <w:rPr>
-                <w:rFonts w:ascii="Times New Roman" w:hAnsi="Times New Roman" w:cs="Times New Roman"/>
-                <w:sz w:val="28"/>
-                <w:szCs w:val="28"/>
-                <w:lang w:val="uk-UA"/>
-              </w:rPr>
-              <w:t>orderPreparedByFirstName</w:t>
-            </w:r>
-            <w:proofErr w:type="spellEnd"/>
-            <w:r>
-              <w:rPr>
-                <w:rFonts w:ascii="Times New Roman" w:hAnsi="Times New Roman" w:cs="Times New Roman"/>
-                <w:sz w:val="28"/>
-                <w:szCs w:val="28"/>
-                <w:lang w:val="uk-UA"/>
-              </w:rPr>
-              <w:t>}</w:t>
-            </w:r>
-            <w:r>
-              <w:rPr>
-                <w:rFonts w:ascii="Times New Roman" w:hAnsi="Times New Roman" w:cs="Times New Roman"/>
-                <w:sz w:val="28"/>
-                <w:szCs w:val="28"/>
-                <w:lang w:val="uk-UA"/>
-              </w:rPr>
-              <w:t xml:space="preserve"> </w:t>
-            </w:r>
-            <w:r>
-              <w:rPr>
-                <w:rFonts w:ascii="Times New Roman" w:hAnsi="Times New Roman" w:cs="Times New Roman"/>
-                <w:sz w:val="28"/>
-                <w:szCs w:val="28"/>
-                <w:lang w:val="uk-UA"/>
-              </w:rPr>
-              <w:t>{</w:t>
-            </w:r>
-            <w:proofErr w:type="spellStart"/>
-            <w:r>
-              <w:rPr>
-                <w:rFonts w:ascii="Times New Roman" w:hAnsi="Times New Roman" w:cs="Times New Roman"/>
-                <w:sz w:val="28"/>
-                <w:szCs w:val="28"/>
-                <w:lang w:val="uk-UA"/>
-              </w:rPr>
-              <w:t>orderPreparedByLastName</w:t>
-            </w:r>
-            <w:proofErr w:type="spellEnd"/>
-            <w:r>
-              <w:rPr>
-                <w:rFonts w:ascii="Times New Roman" w:hAnsi="Times New Roman" w:cs="Times New Roman"/>
-                <w:sz w:val="28"/>
-                <w:szCs w:val="28"/>
-                <w:lang w:val="uk-UA"/>
-              </w:rPr>
-              <w:t>}</w:t>
-            </w:r>
-          </w:p>
-        </w:tc>
-      </w:tr>
-    </w:tbl>
-    <w:p>
-      <w:pPr>
-        <w:spacing w:line="240" w:lineRule="auto"/>
-        <w:rPr>
-          <w:rFonts w:ascii="Times New Roman" w:hAnsi="Times New Roman" w:cs="Times New Roman"/>
-          <w:sz w:val="28"/>
-          <w:szCs w:val="28"/>
-          <w:lang w:val="uk-UA"/>
-        </w:rPr>
-      </w:pPr>
-      <w:r>
-        <w:rPr>
-          <w:rFonts w:ascii="Times New Roman" w:hAnsi="Times New Roman" w:cs="Times New Roman"/>
-          <w:sz w:val="28"/>
-          <w:szCs w:val="28"/>
-          <w:lang w:val="uk-UA"/>
-        </w:rPr>
-        <w:t>{</w:t>
-      </w:r>
-      <w:proofErr w:type="spellStart"/>
-      <w:r>
-        <w:rPr>
-          <w:rFonts w:ascii="Times New Roman" w:hAnsi="Times New Roman" w:cs="Times New Roman"/>
-          <w:sz w:val="28"/>
-          <w:szCs w:val="28"/>
-          <w:lang w:val="uk-UA"/>
-        </w:rPr>
-        <w:t>orderPreparedByDay</w:t>
-      </w:r>
-      <w:proofErr w:type="spellEnd"/>
-      <w:r>
-        <w:rPr>
-          <w:rFonts w:ascii="Times New Roman" w:hAnsi="Times New Roman" w:cs="Times New Roman"/>
-          <w:sz w:val="28"/>
-          <w:szCs w:val="28"/>
-          <w:lang w:val="uk-UA"/>
-        </w:rPr>
-        <w:t>} {</w:t>
-      </w:r>
-      <w:proofErr w:type="spellStart"/>
-      <w:r>
-        <w:rPr>
-          <w:rFonts w:ascii="Times New Roman" w:hAnsi="Times New Roman" w:cs="Times New Roman"/>
-          <w:sz w:val="28"/>
-          <w:szCs w:val="28"/>
-          <w:lang w:val="uk-UA"/>
-        </w:rPr>
-        <w:t>orderPreparedByMonth</w:t>
-      </w:r>
-      <w:proofErr w:type="spellEnd"/>
-      <w:r>
-        <w:rPr>
-          <w:rFonts w:ascii="Times New Roman" w:hAnsi="Times New Roman" w:cs="Times New Roman"/>
-          <w:sz w:val="28"/>
-          <w:szCs w:val="28"/>
-          <w:lang w:val="uk-UA"/>
-        </w:rPr>
-        <w:t>} {</w:t>
-      </w:r>
-      <w:proofErr w:type="spellStart"/>
-      <w:r>
-        <w:rPr>
-          <w:rFonts w:ascii="Times New Roman" w:hAnsi="Times New Roman" w:cs="Times New Roman"/>
-          <w:sz w:val="28"/>
-          <w:szCs w:val="28"/>
-          <w:lang w:val="uk-UA"/>
-        </w:rPr>
-        <w:t>orderPreparedByYear</w:t>
-      </w:r>
-      <w:proofErr w:type="spellEnd"/>
-      <w:r>
-        <w:rPr>
-          <w:rFonts w:ascii="Times New Roman" w:hAnsi="Times New Roman" w:cs="Times New Roman"/>
-          <w:sz w:val="28"/>
-          <w:szCs w:val="28"/>
-          <w:lang w:val="uk-UA"/>
-        </w:rPr>
-        <w:t>}</w:t>
-      </w:r>
     </w:p>
     <w:p>
       <w:pPr>
@@ -2916,7 +2738,7 @@
   <w:style w:type="paragraph" w:default="1" w:styleId="a">
     <w:name w:val="Normal"/>
     <w:qFormat/>
-    <w:rsid w:val="00716F47"/>
+    <w:rsid w:val="00B91822"/>
     <w:rPr>
       <w:lang w:val="ru-RU"/>
     </w:rPr>

</xml_diff>